<commit_message>
Update PfBDP1 from cdeaa09
</commit_message>
<xml_diff>
--- a/docs/manuscripts/pfbdp1-enamine/index.docx
+++ b/docs/manuscripts/pfbdp1-enamine/index.docx
@@ -7,7 +7,7 @@
         <w:pStyle w:val="Title"/>
       </w:pPr>
       <w:r>
-        <w:t xml:space="preserve">Large-Scale Virtual Screening of Enamine 4.6 Millions compounds against Plasmodium Bromodomain PfBDP1</w:t>
+        <w:t xml:space="preserve">Large-Scale Virtual Screening of 4.6 Million Enamine Compounds against Plasmodium Bromodomain PfBDP1</w:t>
       </w:r>
     </w:p>
     <w:p>
@@ -55,7 +55,7 @@
         <w:pStyle w:val="Date"/>
       </w:pPr>
       <w:r>
-        <w:t xml:space="preserve">2026-07-29</w:t>
+        <w:t xml:space="preserve">2026-07-31</w:t>
       </w:r>
     </w:p>
     <w:p>
@@ -330,7 +330,7 @@
         <w:t xml:space="preserve">(Amann et al. 2025)</w:t>
       </w:r>
       <w:r>
-        <w:t xml:space="preserve">. The same study reported the 1.56 Å crystal structure of PfBDP1 bound to the ligand MPM2</w:t>
+        <w:t xml:space="preserve">. The same study reported the 1.56 Å crystal structure of PfBDP1 bound to the ligand I5K</w:t>
       </w:r>
       <w:r>
         <w:t xml:space="preserve"> </w:t>
@@ -390,7 +390,7 @@
         <w:t xml:space="preserve"> </w:t>
       </w:r>
       <w:r>
-        <w:t xml:space="preserve">pose of MPM2, then screened the library using the validated binding site and</w:t>
+        <w:t xml:space="preserve">pose of I5K, then screened the library using the validated binding site and</w:t>
       </w:r>
       <w:r>
         <w:t xml:space="preserve"> </w:t>
@@ -459,6 +459,12 @@
       <w:r>
         <w:t xml:space="preserve">bromodomain protein 1 (PfBDP1). The docking workflow comprised ligand and receptor preparation, cognate-ligand redocking, molecular docking, physicochemical filtering, substructure filtering, pose validation, and hit ranking.</w:t>
       </w:r>
+      <w:r>
+        <w:t xml:space="preserve"> </w:t>
+      </w:r>
+      <w:r>
+        <w:t xml:space="preserve">The complete screening workflow is summarized in Supplementary Figure S2.</w:t>
+      </w:r>
     </w:p>
     <w:bookmarkEnd w:id="10"/>
     <w:bookmarkStart w:id="11" w:name="compound-library-and-ligand-preparation"/>
@@ -536,7 +542,7 @@
         <w:t xml:space="preserve"> </w:t>
       </w:r>
       <w:r>
-        <w:t xml:space="preserve">three-dimensional molecular were excluded.</w:t>
+        <w:t xml:space="preserve">three-dimensional molecular structures were excluded.</w:t>
       </w:r>
     </w:p>
     <w:p>
@@ -571,7 +577,7 @@
         <w:pStyle w:val="FirstParagraph"/>
       </w:pPr>
       <w:r>
-        <w:t xml:space="preserve">The 1.56 Å X-ray structure of PfBDP1 bound to MPM2 was identified as</w:t>
+        <w:t xml:space="preserve">The 1.56 Å X-ray structure of PfBDP1 bound to I5K was identified as</w:t>
       </w:r>
       <w:r>
         <w:t xml:space="preserve"> </w:t>
@@ -711,7 +717,13 @@
         <w:t xml:space="preserve"> </w:t>
       </w:r>
       <w:r>
-        <w:t xml:space="preserve">before analysis as successful recovery of the experimental binding mode. At</w:t>
+        <w:t xml:space="preserve">before analysis as successful recovery of the experimental binding mode</w:t>
+      </w:r>
+      <w:r>
+        <w:t xml:space="preserve"> </w:t>
+      </w:r>
+      <w:r>
+        <w:t xml:space="preserve">irrespective of the docking pose number/ranking. At</w:t>
       </w:r>
       <w:r>
         <w:t xml:space="preserve"> </w:t>
@@ -803,6 +815,26 @@
       <w:r>
         <w:t xml:space="preserve">. Only compounds with no failed PoseBusters tests were accepted. Passing structures were ranked by docking score. The five highest-priority compounds were selected for subsequent molecular-dynamics simulation and endpoint free-energy calculations.</w:t>
       </w:r>
+      <w:r>
+        <w:t xml:space="preserve"> </w:t>
+      </w:r>
+      <w:r>
+        <w:t xml:space="preserve">Docking and hit-selection records are provided in</w:t>
+      </w:r>
+      <w:r>
+        <w:t xml:space="preserve"> </w:t>
+      </w:r>
+      <w:hyperlink w:anchor="dat-screening-results">
+        <w:r>
+          <w:rPr>
+            <w:rStyle w:val="Hyperlink"/>
+          </w:rPr>
+          <w:t xml:space="preserve">Supplementary Data S1</w:t>
+        </w:r>
+      </w:hyperlink>
+      <w:r>
+        <w:t xml:space="preserve">.</w:t>
+      </w:r>
     </w:p>
     <w:bookmarkEnd w:id="17"/>
     <w:bookmarkStart w:id="18" w:name="in-silico-admet-profiling"/>
@@ -848,6 +880,26 @@
       <w:r>
         <w:t xml:space="preserve">.</w:t>
       </w:r>
+      <w:r>
+        <w:t xml:space="preserve"> </w:t>
+      </w:r>
+      <w:r>
+        <w:t xml:space="preserve">Complete prediction outputs are provided in</w:t>
+      </w:r>
+      <w:r>
+        <w:t xml:space="preserve"> </w:t>
+      </w:r>
+      <w:hyperlink w:anchor="dat-admet-profiles">
+        <w:r>
+          <w:rPr>
+            <w:rStyle w:val="Hyperlink"/>
+          </w:rPr>
+          <w:t xml:space="preserve">Supplementary Data S2</w:t>
+        </w:r>
+      </w:hyperlink>
+      <w:r>
+        <w:t xml:space="preserve">.</w:t>
+      </w:r>
     </w:p>
     <w:bookmarkEnd w:id="18"/>
     <w:bookmarkStart w:id="22" w:name="molecular-dynamics-and-mmgbsa-analysis"/>
@@ -906,20 +958,7 @@
         <w:t xml:space="preserve"> </w:t>
       </w:r>
       <w:r>
-        <w:t xml:space="preserve">(Ahmed et al. 2026;</w:t>
-      </w:r>
-      <w:r>
-        <w:t xml:space="preserve"> </w:t>
-      </w:r>
-      <w:r>
-        <w:rPr>
-          <w:b/>
-          <w:bCs/>
-        </w:rPr>
-        <w:t xml:space="preserve">ApplicationBioactiveMolecular2025?</w:t>
-      </w:r>
-      <w:r>
-        <w:t xml:space="preserve">)</w:t>
+        <w:t xml:space="preserve">(Ahmed et al. 2026; Nguyen et al. 2025)</w:t>
       </w:r>
       <w:r>
         <w:t xml:space="preserve">. Ligand topologies</w:t>
@@ -1602,7 +1641,7 @@
     <w:bookmarkEnd w:id="21"/>
     <w:bookmarkEnd w:id="22"/>
     <w:bookmarkEnd w:id="23"/>
-    <w:bookmarkStart w:id="102" w:name="results-and-discussion"/>
+    <w:bookmarkStart w:id="44" w:name="results-and-discussion"/>
     <w:p>
       <w:pPr>
         <w:pStyle w:val="Heading1"/>
@@ -1648,25 +1687,51 @@
         </w:r>
       </w:hyperlink>
       <w:r>
-        <w:t xml:space="preserve">). The candidates differed in</w:t>
-      </w:r>
-      <w:r>
-        <w:t xml:space="preserve"> </w:t>
-      </w:r>
-      <w:r>
-        <w:t xml:space="preserve">molecular size, ring architecture, heteroatom content, substitution patterns,</w:t>
-      </w:r>
-      <w:r>
-        <w:t xml:space="preserve"> </w:t>
-      </w:r>
-      <w:r>
-        <w:t xml:space="preserve">and stereochemical complexity. Z1723441401 and Z31277728 contain several</w:t>
-      </w:r>
-      <w:r>
-        <w:t xml:space="preserve"> </w:t>
-      </w:r>
-      <w:r>
-        <w:t xml:space="preserve">carbonyl and heterocyclic features, while Z9033488415 and Z985612796 include</w:t>
+        <w:t xml:space="preserve">). Docking and hit-selection</w:t>
+      </w:r>
+      <w:r>
+        <w:t xml:space="preserve"> </w:t>
+      </w:r>
+      <w:r>
+        <w:t xml:space="preserve">records are provided in</w:t>
+      </w:r>
+      <w:r>
+        <w:t xml:space="preserve"> </w:t>
+      </w:r>
+      <w:hyperlink w:anchor="dat-screening-results">
+        <w:r>
+          <w:rPr>
+            <w:rStyle w:val="Hyperlink"/>
+          </w:rPr>
+          <w:t xml:space="preserve">Supplementary Data S1</w:t>
+        </w:r>
+      </w:hyperlink>
+      <w:r>
+        <w:t xml:space="preserve">. The candidates differed</w:t>
+      </w:r>
+      <w:r>
+        <w:t xml:space="preserve"> </w:t>
+      </w:r>
+      <w:r>
+        <w:t xml:space="preserve">in molecular size, ring architecture, heteroatom content, substitution</w:t>
+      </w:r>
+      <w:r>
+        <w:t xml:space="preserve"> </w:t>
+      </w:r>
+      <w:r>
+        <w:t xml:space="preserve">patterns, and stereochemical complexity. Z1723441401 and Z31277728 contain</w:t>
+      </w:r>
+      <w:r>
+        <w:t xml:space="preserve"> </w:t>
+      </w:r>
+      <w:r>
+        <w:t xml:space="preserve">several carbonyl and heterocyclic features, while Z9033488415 and</w:t>
+      </w:r>
+      <w:r>
+        <w:t xml:space="preserve"> </w:t>
+      </w:r>
+      <w:r>
+        <w:t xml:space="preserve">Z985612796 include</w:t>
       </w:r>
       <w:r>
         <w:t xml:space="preserve"> </w:t>
@@ -1791,7 +1856,7 @@
       </w:tr>
     </w:tbl>
     <w:bookmarkEnd w:id="28"/>
-    <w:bookmarkStart w:id="40" w:name="molecular-dynamics-and-mmgbsa-analysis-1"/>
+    <w:bookmarkStart w:id="41" w:name="molecular-dynamics-and-mmgbsa-analysis-1"/>
     <w:p>
       <w:pPr>
         <w:pStyle w:val="Heading2"/>
@@ -1848,19 +1913,30 @@
         <w:t xml:space="preserve"> </w:t>
       </w:r>
       <w:r>
-        <w:t xml:space="preserve">at 10-ps intervals. Unless otherwise stated, time-averaged parameters were</w:t>
-      </w:r>
-      <w:r>
-        <w:t xml:space="preserve"> </w:t>
-      </w:r>
-      <w:r>
-        <w:t xml:space="preserve">calculated over the 20–100 ns interval to minimize the influence of initial</w:t>
-      </w:r>
-      <w:r>
-        <w:t xml:space="preserve"> </w:t>
-      </w:r>
-      <w:r>
-        <w:t xml:space="preserve">structural relaxation.</w:t>
+        <w:t xml:space="preserve">at 10-ps intervals (</w:t>
+      </w:r>
+      <w:hyperlink w:anchor="fig-md-stability">
+        <w:r>
+          <w:rPr>
+            <w:rStyle w:val="Hyperlink"/>
+          </w:rPr>
+          <w:t xml:space="preserve">Figure 2</w:t>
+        </w:r>
+      </w:hyperlink>
+      <w:r>
+        <w:t xml:space="preserve">). Unless otherwise stated, time-averaged</w:t>
+      </w:r>
+      <w:r>
+        <w:t xml:space="preserve"> </w:t>
+      </w:r>
+      <w:r>
+        <w:t xml:space="preserve">parameters were calculated over the 20–100 ns interval to minimize the</w:t>
+      </w:r>
+      <w:r>
+        <w:t xml:space="preserve"> </w:t>
+      </w:r>
+      <w:r>
+        <w:t xml:space="preserve">influence of initial structural relaxation.</w:t>
       </w:r>
     </w:p>
     <w:p>
@@ -1892,7 +1968,24 @@
         <w:t xml:space="preserve"> </w:t>
       </w:r>
       <w:r>
-        <w:t xml:space="preserve">The radius of gyration remained within 1.635–1.672 nm across all systems.</w:t>
+        <w:t xml:space="preserve">The radius of gyration remained within 1.635–1.672 nm across all systems</w:t>
+      </w:r>
+      <w:r>
+        <w:t xml:space="preserve"> </w:t>
+      </w:r>
+      <w:r>
+        <w:t xml:space="preserve">(</w:t>
+      </w:r>
+      <w:hyperlink w:anchor="fig-md-stability">
+        <w:r>
+          <w:rPr>
+            <w:rStyle w:val="Hyperlink"/>
+          </w:rPr>
+          <w:t xml:space="preserve">Figure 2</w:t>
+        </w:r>
+      </w:hyperlink>
+      <w:r>
+        <w:t xml:space="preserve">, panels A and E).</w:t>
       </w:r>
     </w:p>
     <w:p>
@@ -1924,7 +2017,24 @@
         <w:t xml:space="preserve"> </w:t>
       </w:r>
       <w:r>
-        <w:t xml:space="preserve">0.286 ± 0.014 nm despite its low protein backbone RMSD.</w:t>
+        <w:t xml:space="preserve">0.286 ± 0.014 nm despite its low protein backbone RMSD</w:t>
+      </w:r>
+      <w:r>
+        <w:t xml:space="preserve"> </w:t>
+      </w:r>
+      <w:r>
+        <w:t xml:space="preserve">(</w:t>
+      </w:r>
+      <w:hyperlink w:anchor="fig-md-stability">
+        <w:r>
+          <w:rPr>
+            <w:rStyle w:val="Hyperlink"/>
+          </w:rPr>
+          <w:t xml:space="preserve">Figure 2</w:t>
+        </w:r>
+      </w:hyperlink>
+      <w:r>
+        <w:t xml:space="preserve">, panel B).</w:t>
       </w:r>
     </w:p>
     <w:p>
@@ -1956,7 +2066,18 @@
         <w:t xml:space="preserve"> </w:t>
       </w:r>
       <w:r>
-        <w:t xml:space="preserve">RMSF with the highest ligand RMSF.</w:t>
+        <w:t xml:space="preserve">RMSF with the highest ligand RMSF (</w:t>
+      </w:r>
+      <w:hyperlink w:anchor="fig-md-stability">
+        <w:r>
+          <w:rPr>
+            <w:rStyle w:val="Hyperlink"/>
+          </w:rPr>
+          <w:t xml:space="preserve">Figure 2</w:t>
+        </w:r>
+      </w:hyperlink>
+      <w:r>
+        <w:t xml:space="preserve">, panels C and D).</w:t>
       </w:r>
     </w:p>
     <w:p>
@@ -1982,7 +2103,18 @@
         <w:t xml:space="preserve"> </w:t>
       </w:r>
       <w:r>
-        <w:t xml:space="preserve">standard deviations.</w:t>
+        <w:t xml:space="preserve">standard deviations (</w:t>
+      </w:r>
+      <w:hyperlink w:anchor="fig-md-stability">
+        <w:r>
+          <w:rPr>
+            <w:rStyle w:val="Hyperlink"/>
+          </w:rPr>
+          <w:t xml:space="preserve">Figure 2</w:t>
+        </w:r>
+      </w:hyperlink>
+      <w:r>
+        <w:t xml:space="preserve">, panels E and F).</w:t>
       </w:r>
     </w:p>
     <w:p>
@@ -2020,7 +2152,24 @@
         <w:t xml:space="preserve"> </w:t>
       </w:r>
       <w:r>
-        <w:t xml:space="preserve">rearrangements of the PfBDP1 bromodomain.</w:t>
+        <w:t xml:space="preserve">rearrangements of the PfBDP1 bromodomain</w:t>
+      </w:r>
+      <w:r>
+        <w:t xml:space="preserve"> </w:t>
+      </w:r>
+      <w:r>
+        <w:t xml:space="preserve">(</w:t>
+      </w:r>
+      <w:hyperlink w:anchor="fig-md-stability">
+        <w:r>
+          <w:rPr>
+            <w:rStyle w:val="Hyperlink"/>
+          </w:rPr>
+          <w:t xml:space="preserve">Figure 2</w:t>
+        </w:r>
+      </w:hyperlink>
+      <w:r>
+        <w:t xml:space="preserve">, panels A and E).</w:t>
       </w:r>
     </w:p>
     <w:p>
@@ -2058,7 +2207,18 @@
         <w:t xml:space="preserve"> </w:t>
       </w:r>
       <w:r>
-        <w:t xml:space="preserve">approximately 82% of frames.</w:t>
+        <w:t xml:space="preserve">approximately 82% of frames (</w:t>
+      </w:r>
+      <w:hyperlink w:anchor="fig-md-stability">
+        <w:r>
+          <w:rPr>
+            <w:rStyle w:val="Hyperlink"/>
+          </w:rPr>
+          <w:t xml:space="preserve">Figure 2</w:t>
+        </w:r>
+      </w:hyperlink>
+      <w:r>
+        <w:t xml:space="preserve">, panel G).</w:t>
       </w:r>
     </w:p>
     <w:p>
@@ -2102,7 +2262,24 @@
         <w:t xml:space="preserve"> </w:t>
       </w:r>
       <w:r>
-        <w:t xml:space="preserve">persistent hydrogen bonds, giving it the most consistent stability profile.</w:t>
+        <w:t xml:space="preserve">persistent hydrogen bonds, giving it the most consistent stability profile</w:t>
+      </w:r>
+      <w:r>
+        <w:t xml:space="preserve"> </w:t>
+      </w:r>
+      <w:r>
+        <w:t xml:space="preserve">(</w:t>
+      </w:r>
+      <w:hyperlink w:anchor="fig-md-stability">
+        <w:r>
+          <w:rPr>
+            <w:rStyle w:val="Hyperlink"/>
+          </w:rPr>
+          <w:t xml:space="preserve">Figure 2</w:t>
+        </w:r>
+      </w:hyperlink>
+      <w:r>
+        <w:t xml:space="preserve">, panels A–G).</w:t>
       </w:r>
     </w:p>
     <w:tbl>
@@ -2255,6 +2432,26 @@
       <w:r>
         <w:t xml:space="preserve">Z9302730850 exhibited the largest dispersion along the principal components.</w:t>
       </w:r>
+      <w:r>
+        <w:t xml:space="preserve"> </w:t>
+      </w:r>
+      <w:r>
+        <w:t xml:space="preserve">These conformational distributions are shown in</w:t>
+      </w:r>
+      <w:r>
+        <w:t xml:space="preserve"> </w:t>
+      </w:r>
+      <w:hyperlink w:anchor="fig-pca-landscapes">
+        <w:r>
+          <w:rPr>
+            <w:rStyle w:val="Hyperlink"/>
+          </w:rPr>
+          <w:t xml:space="preserve">Figure 3</w:t>
+        </w:r>
+      </w:hyperlink>
+      <w:r>
+        <w:t xml:space="preserve">, panel A.</w:t>
+      </w:r>
     </w:p>
     <w:p>
       <w:pPr>
@@ -2291,7 +2488,18 @@
         <w:t xml:space="preserve"> </w:t>
       </w:r>
       <w:r>
-        <w:t xml:space="preserve">basin.</w:t>
+        <w:t xml:space="preserve">basin (</w:t>
+      </w:r>
+      <w:hyperlink w:anchor="fig-pca-landscapes">
+        <w:r>
+          <w:rPr>
+            <w:rStyle w:val="Hyperlink"/>
+          </w:rPr>
+          <w:t xml:space="preserve">Figure 3</w:t>
+        </w:r>
+      </w:hyperlink>
+      <w:r>
+        <w:t xml:space="preserve">, panel B).</w:t>
       </w:r>
     </w:p>
     <w:p>
@@ -2341,7 +2549,18 @@
         <w:t xml:space="preserve"> </w:t>
       </w:r>
       <w:r>
-        <w:t xml:space="preserve">for Z985612796.</w:t>
+        <w:t xml:space="preserve">for Z985612796 (</w:t>
+      </w:r>
+      <w:hyperlink w:anchor="fig-pca-landscapes">
+        <w:r>
+          <w:rPr>
+            <w:rStyle w:val="Hyperlink"/>
+          </w:rPr>
+          <w:t xml:space="preserve">Figure 3</w:t>
+        </w:r>
+      </w:hyperlink>
+      <w:r>
+        <w:t xml:space="preserve">, panels A and B).</w:t>
       </w:r>
     </w:p>
     <w:tbl>
@@ -2466,7 +2685,7 @@
       </w:tr>
     </w:tbl>
     <w:bookmarkEnd w:id="38"/>
-    <w:bookmarkStart w:id="39" w:name="mmgbsa-binding-energy-estimates"/>
+    <w:bookmarkStart w:id="40" w:name="mmgbsa-binding-energy-estimates"/>
     <w:p>
       <w:pPr>
         <w:pStyle w:val="Heading3"/>
@@ -2480,11 +2699,21 @@
         <w:pStyle w:val="FirstParagraph"/>
       </w:pPr>
       <w:r>
-        <w:rPr>
-          <w:b/>
-          <w:bCs/>
-        </w:rPr>
-        <w:t xml:space="preserve">Table 1. MM/GBSA energy components of the PfBDP1–ligand complexes.</w:t>
+        <w:t xml:space="preserve">The component and total endpoint estimates are summarized in</w:t>
+      </w:r>
+      <w:r>
+        <w:t xml:space="preserve"> </w:t>
+      </w:r>
+      <w:hyperlink w:anchor="tbl-mmgbsa">
+        <w:r>
+          <w:rPr>
+            <w:rStyle w:val="Hyperlink"/>
+          </w:rPr>
+          <w:t xml:space="preserve">Table 1</w:t>
+        </w:r>
+      </w:hyperlink>
+      <w:r>
+        <w:t xml:space="preserve">.</w:t>
       </w:r>
     </w:p>
     <w:tbl>
@@ -2492,803 +2721,891 @@
         <w:tblStyle w:val="Table"/>
         <w:tblW w:type="pct" w:w="5000"/>
         <w:tblLayout w:type="fixed"/>
-        <w:tblLook w:firstRow="1" w:lastRow="0" w:firstColumn="0" w:lastColumn="0" w:noHBand="0" w:noVBand="0" w:val="0020"/>
+        <w:tblLook w:firstRow="0" w:lastRow="0" w:firstColumn="0" w:lastColumn="0" w:noHBand="0" w:noVBand="0" w:val="0000"/>
       </w:tblPr>
       <w:tblGrid>
-        <w:gridCol w:w="766"/>
-        <w:gridCol w:w="1021"/>
-        <w:gridCol w:w="1021"/>
-        <w:gridCol w:w="1021"/>
-        <w:gridCol w:w="1021"/>
-        <w:gridCol w:w="1021"/>
-        <w:gridCol w:w="1021"/>
-        <w:gridCol w:w="1021"/>
+        <w:gridCol w:w="7920"/>
       </w:tblGrid>
-      <w:tr>
-        <w:trPr>
-          <w:tblHeader w:val="on"/>
-        </w:trPr>
-        <w:tc>
-          <w:tcPr/>
-          <w:p>
-            <w:pPr>
-              <w:pStyle w:val="Compact"/>
-            </w:pPr>
-            <w:r>
-              <w:rPr>
-                <w:b/>
-                <w:bCs/>
-              </w:rPr>
-              <w:t xml:space="preserve">Ligand</w:t>
-            </w:r>
-          </w:p>
-        </w:tc>
-        <w:tc>
-          <w:tcPr/>
-          <w:p>
-            <w:pPr>
-              <w:pStyle w:val="Compact"/>
-              <w:jc w:val="right"/>
-            </w:pPr>
-            <w:r>
-              <w:rPr>
-                <w:b/>
-                <w:bCs/>
-              </w:rPr>
-              <w:t xml:space="preserve">ΔE</w:t>
-            </w:r>
-            <w:r>
-              <w:rPr>
-                <w:b/>
-                <w:bCs/>
-              </w:rPr>
-              <w:t xml:space="preserve">VDW</w:t>
-            </w:r>
-          </w:p>
-        </w:tc>
-        <w:tc>
-          <w:tcPr/>
-          <w:p>
-            <w:pPr>
-              <w:pStyle w:val="Compact"/>
-              <w:jc w:val="right"/>
-            </w:pPr>
-            <w:r>
-              <w:rPr>
-                <w:b/>
-                <w:bCs/>
-              </w:rPr>
-              <w:t xml:space="preserve">ΔE</w:t>
-            </w:r>
-            <w:r>
-              <w:rPr>
-                <w:b/>
-                <w:bCs/>
-              </w:rPr>
-              <w:t xml:space="preserve">ELE</w:t>
-            </w:r>
-          </w:p>
-        </w:tc>
-        <w:tc>
-          <w:tcPr/>
-          <w:p>
-            <w:pPr>
-              <w:pStyle w:val="Compact"/>
-              <w:jc w:val="right"/>
-            </w:pPr>
-            <w:r>
-              <w:rPr>
-                <w:b/>
-                <w:bCs/>
-              </w:rPr>
-              <w:t xml:space="preserve">ΔE</w:t>
-            </w:r>
-            <w:r>
-              <w:rPr>
-                <w:b/>
-                <w:bCs/>
-              </w:rPr>
-              <w:t xml:space="preserve">GB</w:t>
-            </w:r>
-          </w:p>
-        </w:tc>
-        <w:tc>
-          <w:tcPr/>
-          <w:p>
-            <w:pPr>
-              <w:pStyle w:val="Compact"/>
-              <w:jc w:val="right"/>
-            </w:pPr>
-            <w:r>
-              <w:rPr>
-                <w:b/>
-                <w:bCs/>
-              </w:rPr>
-              <w:t xml:space="preserve">ΔE</w:t>
-            </w:r>
-            <w:r>
-              <w:rPr>
-                <w:b/>
-                <w:bCs/>
-              </w:rPr>
-              <w:t xml:space="preserve">SURF</w:t>
-            </w:r>
-          </w:p>
-        </w:tc>
-        <w:tc>
-          <w:tcPr/>
-          <w:p>
-            <w:pPr>
-              <w:pStyle w:val="Compact"/>
-              <w:jc w:val="right"/>
-            </w:pPr>
-            <w:r>
-              <w:rPr>
-                <w:b/>
-                <w:bCs/>
-              </w:rPr>
-              <w:t xml:space="preserve">ΔG</w:t>
-            </w:r>
-            <w:r>
-              <w:rPr>
-                <w:b/>
-                <w:bCs/>
-              </w:rPr>
-              <w:t xml:space="preserve">GAS</w:t>
-            </w:r>
-          </w:p>
-        </w:tc>
-        <w:tc>
-          <w:tcPr/>
-          <w:p>
-            <w:pPr>
-              <w:pStyle w:val="Compact"/>
-              <w:jc w:val="right"/>
-            </w:pPr>
-            <w:r>
-              <w:rPr>
-                <w:b/>
-                <w:bCs/>
-              </w:rPr>
-              <w:t xml:space="preserve">ΔG</w:t>
-            </w:r>
-            <w:r>
-              <w:rPr>
-                <w:b/>
-                <w:bCs/>
-              </w:rPr>
-              <w:t xml:space="preserve">SOLV</w:t>
-            </w:r>
-          </w:p>
-        </w:tc>
-        <w:tc>
-          <w:tcPr/>
-          <w:p>
-            <w:pPr>
-              <w:pStyle w:val="Compact"/>
-              <w:jc w:val="right"/>
-            </w:pPr>
-            <w:r>
-              <w:rPr>
-                <w:b/>
-                <w:bCs/>
-              </w:rPr>
-              <w:t xml:space="preserve">ΔG</w:t>
-            </w:r>
-            <w:r>
-              <w:rPr>
-                <w:b/>
-                <w:bCs/>
-              </w:rPr>
-              <w:t xml:space="preserve">MM/GBSA</w:t>
-            </w:r>
-          </w:p>
-        </w:tc>
-      </w:tr>
       <w:tr>
         <w:tc>
           <w:tcPr/>
+          <w:bookmarkStart w:id="39" w:name="tbl-mmgbsa"/>
           <w:p>
             <w:pPr>
-              <w:pStyle w:val="Compact"/>
+              <w:jc w:val="center"/>
+            </w:pPr>
+            <w:pPr>
+              <w:jc w:val="left"/>
+              <w:spacing w:before="200"/>
+              <w:pStyle w:val="ImageCaption"/>
             </w:pPr>
             <w:r>
-              <w:rPr>
-                <w:b/>
-                <w:bCs/>
-              </w:rPr>
-              <w:t xml:space="preserve">I5K</w:t>
+              <w:t xml:space="preserve">Table 1: MM/GBSA energy components of the PfBDP1–ligand complexes.</w:t>
             </w:r>
           </w:p>
-        </w:tc>
-        <w:tc>
-          <w:tcPr/>
-          <w:p>
-            <w:pPr>
-              <w:pStyle w:val="Compact"/>
-              <w:jc w:val="right"/>
-            </w:pPr>
-            <w:r>
-              <w:t xml:space="preserve">-14.59 ± 0.64</w:t>
-            </w:r>
-          </w:p>
-        </w:tc>
-        <w:tc>
-          <w:tcPr/>
-          <w:p>
-            <w:pPr>
-              <w:pStyle w:val="Compact"/>
-              <w:jc w:val="right"/>
-            </w:pPr>
-            <w:r>
-              <w:t xml:space="preserve">-9.94 ± 0.45</w:t>
-            </w:r>
-          </w:p>
-        </w:tc>
-        <w:tc>
-          <w:tcPr/>
-          <w:p>
-            <w:pPr>
-              <w:pStyle w:val="Compact"/>
-              <w:jc w:val="right"/>
-            </w:pPr>
-            <w:r>
-              <w:t xml:space="preserve">14.10 ± 0.60</w:t>
-            </w:r>
-          </w:p>
-        </w:tc>
-        <w:tc>
-          <w:tcPr/>
-          <w:p>
-            <w:pPr>
-              <w:pStyle w:val="Compact"/>
-              <w:jc w:val="right"/>
-            </w:pPr>
-            <w:r>
-              <w:t xml:space="preserve">-2.22 ± 0.10</w:t>
-            </w:r>
-          </w:p>
-        </w:tc>
-        <w:tc>
-          <w:tcPr/>
-          <w:p>
-            <w:pPr>
-              <w:pStyle w:val="Compact"/>
-              <w:jc w:val="right"/>
-            </w:pPr>
-            <w:r>
-              <w:t xml:space="preserve">-24.53 ± 1.06</w:t>
-            </w:r>
-          </w:p>
-        </w:tc>
-        <w:tc>
-          <w:tcPr/>
-          <w:p>
-            <w:pPr>
-              <w:pStyle w:val="Compact"/>
-              <w:jc w:val="right"/>
-            </w:pPr>
-            <w:r>
-              <w:t xml:space="preserve">11.88 ± 0.51</w:t>
-            </w:r>
-          </w:p>
-        </w:tc>
-        <w:tc>
-          <w:tcPr/>
-          <w:p>
-            <w:pPr>
-              <w:pStyle w:val="Compact"/>
-              <w:jc w:val="right"/>
-            </w:pPr>
-            <w:r>
-              <w:t xml:space="preserve">-12.65 ± 0.56</w:t>
-            </w:r>
-          </w:p>
-        </w:tc>
-      </w:tr>
-      <w:tr>
-        <w:tc>
-          <w:tcPr/>
-          <w:p>
-            <w:pPr>
-              <w:pStyle w:val="Compact"/>
-            </w:pPr>
-            <w:r>
-              <w:rPr>
-                <w:b/>
-                <w:bCs/>
-              </w:rPr>
-              <w:t xml:space="preserve">Z1723441401</w:t>
-            </w:r>
-          </w:p>
-        </w:tc>
-        <w:tc>
-          <w:tcPr/>
-          <w:p>
-            <w:pPr>
-              <w:pStyle w:val="Compact"/>
-              <w:jc w:val="right"/>
-            </w:pPr>
-            <w:r>
-              <w:t xml:space="preserve">-31.59 ± 1.11</w:t>
-            </w:r>
-          </w:p>
-        </w:tc>
-        <w:tc>
-          <w:tcPr/>
-          <w:p>
-            <w:pPr>
-              <w:pStyle w:val="Compact"/>
-              <w:jc w:val="right"/>
-            </w:pPr>
-            <w:r>
-              <w:t xml:space="preserve">-16.02 ± 0.62</w:t>
-            </w:r>
-          </w:p>
-        </w:tc>
-        <w:tc>
-          <w:tcPr/>
-          <w:p>
-            <w:pPr>
-              <w:pStyle w:val="Compact"/>
-              <w:jc w:val="right"/>
-            </w:pPr>
-            <w:r>
-              <w:t xml:space="preserve">26.67 ± 0.96</w:t>
-            </w:r>
-          </w:p>
-        </w:tc>
-        <w:tc>
-          <w:tcPr/>
-          <w:p>
-            <w:pPr>
-              <w:pStyle w:val="Compact"/>
-              <w:jc w:val="right"/>
-            </w:pPr>
-            <w:r>
-              <w:t xml:space="preserve">-4.00 ± 0.14</w:t>
-            </w:r>
-          </w:p>
-        </w:tc>
-        <w:tc>
-          <w:tcPr/>
-          <w:p>
-            <w:pPr>
-              <w:pStyle w:val="Compact"/>
-              <w:jc w:val="right"/>
-            </w:pPr>
-            <w:r>
-              <w:t xml:space="preserve">-47.60 ± 1.70</w:t>
-            </w:r>
-          </w:p>
-        </w:tc>
-        <w:tc>
-          <w:tcPr/>
-          <w:p>
-            <w:pPr>
-              <w:pStyle w:val="Compact"/>
-              <w:jc w:val="right"/>
-            </w:pPr>
-            <w:r>
-              <w:t xml:space="preserve">22.67 ± 0.82</w:t>
-            </w:r>
-          </w:p>
-        </w:tc>
-        <w:tc>
-          <w:tcPr/>
-          <w:p>
-            <w:pPr>
-              <w:pStyle w:val="Compact"/>
-              <w:jc w:val="right"/>
-            </w:pPr>
-            <w:r>
-              <w:t xml:space="preserve">-24.93 ± 0.89</w:t>
-            </w:r>
-          </w:p>
-        </w:tc>
-      </w:tr>
-      <w:tr>
-        <w:tc>
-          <w:tcPr/>
-          <w:p>
-            <w:pPr>
-              <w:pStyle w:val="Compact"/>
-            </w:pPr>
-            <w:r>
-              <w:rPr>
-                <w:b/>
-                <w:bCs/>
-              </w:rPr>
-              <w:t xml:space="preserve">Z31277728</w:t>
-            </w:r>
-          </w:p>
-        </w:tc>
-        <w:tc>
-          <w:tcPr/>
-          <w:p>
-            <w:pPr>
-              <w:pStyle w:val="Compact"/>
-              <w:jc w:val="right"/>
-            </w:pPr>
-            <w:r>
-              <w:t xml:space="preserve">-34.49 ± 1.37</w:t>
-            </w:r>
-          </w:p>
-        </w:tc>
-        <w:tc>
-          <w:tcPr/>
-          <w:p>
-            <w:pPr>
-              <w:pStyle w:val="Compact"/>
-              <w:jc w:val="right"/>
-            </w:pPr>
-            <w:r>
-              <w:t xml:space="preserve">-10.35 ± 0.51</w:t>
-            </w:r>
-          </w:p>
-        </w:tc>
-        <w:tc>
-          <w:tcPr/>
-          <w:p>
-            <w:pPr>
-              <w:pStyle w:val="Compact"/>
-              <w:jc w:val="right"/>
-            </w:pPr>
-            <w:r>
-              <w:t xml:space="preserve">27.15 ± 1.11</w:t>
-            </w:r>
-          </w:p>
-        </w:tc>
-        <w:tc>
-          <w:tcPr/>
-          <w:p>
-            <w:pPr>
-              <w:pStyle w:val="Compact"/>
-              <w:jc w:val="right"/>
-            </w:pPr>
-            <w:r>
-              <w:t xml:space="preserve">-4.44 ± 0.18</w:t>
-            </w:r>
-          </w:p>
-        </w:tc>
-        <w:tc>
-          <w:tcPr/>
-          <w:p>
-            <w:pPr>
-              <w:pStyle w:val="Compact"/>
-              <w:jc w:val="right"/>
-            </w:pPr>
-            <w:r>
-              <w:t xml:space="preserve">-44.84 ± 1.83</w:t>
-            </w:r>
-          </w:p>
-        </w:tc>
-        <w:tc>
-          <w:tcPr/>
-          <w:p>
-            <w:pPr>
-              <w:pStyle w:val="Compact"/>
-              <w:jc w:val="right"/>
-            </w:pPr>
-            <w:r>
-              <w:t xml:space="preserve">22.70 ± 0.94</w:t>
-            </w:r>
-          </w:p>
-        </w:tc>
-        <w:tc>
-          <w:tcPr/>
-          <w:p>
-            <w:pPr>
-              <w:pStyle w:val="Compact"/>
-              <w:jc w:val="right"/>
-            </w:pPr>
-            <w:r>
-              <w:t xml:space="preserve">-22.13 ± 0.90</w:t>
-            </w:r>
-          </w:p>
-        </w:tc>
-      </w:tr>
-      <w:tr>
-        <w:tc>
-          <w:tcPr/>
-          <w:p>
-            <w:pPr>
-              <w:pStyle w:val="Compact"/>
-            </w:pPr>
-            <w:r>
-              <w:rPr>
-                <w:b/>
-                <w:bCs/>
-              </w:rPr>
-              <w:t xml:space="preserve">Z9033488415</w:t>
-            </w:r>
-          </w:p>
-        </w:tc>
-        <w:tc>
-          <w:tcPr/>
-          <w:p>
-            <w:pPr>
-              <w:pStyle w:val="Compact"/>
-              <w:jc w:val="right"/>
-            </w:pPr>
-            <w:r>
-              <w:t xml:space="preserve">-28.96 ± 1.26</w:t>
-            </w:r>
-          </w:p>
-        </w:tc>
-        <w:tc>
-          <w:tcPr/>
-          <w:p>
-            <w:pPr>
-              <w:pStyle w:val="Compact"/>
-              <w:jc w:val="right"/>
-            </w:pPr>
-            <w:r>
-              <w:t xml:space="preserve">12.85 ± 0.84</w:t>
-            </w:r>
-          </w:p>
-        </w:tc>
-        <w:tc>
-          <w:tcPr/>
-          <w:p>
-            <w:pPr>
-              <w:pStyle w:val="Compact"/>
-              <w:jc w:val="right"/>
-            </w:pPr>
-            <w:r>
-              <w:t xml:space="preserve">4.86 ± 1.46</w:t>
-            </w:r>
-          </w:p>
-        </w:tc>
-        <w:tc>
-          <w:tcPr/>
-          <w:p>
-            <w:pPr>
-              <w:pStyle w:val="Compact"/>
-              <w:jc w:val="right"/>
-            </w:pPr>
-            <w:r>
-              <w:t xml:space="preserve">-3.59 ± 0.16</w:t>
-            </w:r>
-          </w:p>
-        </w:tc>
-        <w:tc>
-          <w:tcPr/>
-          <w:p>
-            <w:pPr>
-              <w:pStyle w:val="Compact"/>
-              <w:jc w:val="right"/>
-            </w:pPr>
-            <w:r>
-              <w:t xml:space="preserve">-16.11 ± 1.92</w:t>
-            </w:r>
-          </w:p>
-        </w:tc>
-        <w:tc>
-          <w:tcPr/>
-          <w:p>
-            <w:pPr>
-              <w:pStyle w:val="Compact"/>
-              <w:jc w:val="right"/>
-            </w:pPr>
-            <w:r>
-              <w:t xml:space="preserve">1.27 ± 1.32</w:t>
-            </w:r>
-          </w:p>
-        </w:tc>
-        <w:tc>
-          <w:tcPr/>
-          <w:p>
-            <w:pPr>
-              <w:pStyle w:val="Compact"/>
-              <w:jc w:val="right"/>
-            </w:pPr>
-            <w:r>
-              <w:t xml:space="preserve">-14.85 ± 0.66</w:t>
-            </w:r>
-          </w:p>
-        </w:tc>
-      </w:tr>
-      <w:tr>
-        <w:tc>
-          <w:tcPr/>
-          <w:p>
-            <w:pPr>
-              <w:pStyle w:val="Compact"/>
-            </w:pPr>
-            <w:r>
-              <w:rPr>
-                <w:b/>
-                <w:bCs/>
-              </w:rPr>
-              <w:t xml:space="preserve">Z9302730850</w:t>
-            </w:r>
-          </w:p>
-        </w:tc>
-        <w:tc>
-          <w:tcPr/>
-          <w:p>
-            <w:pPr>
-              <w:pStyle w:val="Compact"/>
-              <w:jc w:val="right"/>
-            </w:pPr>
-            <w:r>
-              <w:t xml:space="preserve">-28.75 ± 1.21</w:t>
-            </w:r>
-          </w:p>
-        </w:tc>
-        <w:tc>
-          <w:tcPr/>
-          <w:p>
-            <w:pPr>
-              <w:pStyle w:val="Compact"/>
-              <w:jc w:val="right"/>
-            </w:pPr>
-            <w:r>
-              <w:t xml:space="preserve">-18.63 ± 0.81</w:t>
-            </w:r>
-          </w:p>
-        </w:tc>
-        <w:tc>
-          <w:tcPr/>
-          <w:p>
-            <w:pPr>
-              <w:pStyle w:val="Compact"/>
-              <w:jc w:val="right"/>
-            </w:pPr>
-            <w:r>
-              <w:t xml:space="preserve">27.43 ± 1.15</w:t>
-            </w:r>
-          </w:p>
-        </w:tc>
-        <w:tc>
-          <w:tcPr/>
-          <w:p>
-            <w:pPr>
-              <w:pStyle w:val="Compact"/>
-              <w:jc w:val="right"/>
-            </w:pPr>
-            <w:r>
-              <w:t xml:space="preserve">-3.64 ± 0.15</w:t>
-            </w:r>
-          </w:p>
-        </w:tc>
-        <w:tc>
-          <w:tcPr/>
-          <w:p>
-            <w:pPr>
-              <w:pStyle w:val="Compact"/>
-              <w:jc w:val="right"/>
-            </w:pPr>
-            <w:r>
-              <w:t xml:space="preserve">-47.37 ± 1.99</w:t>
-            </w:r>
-          </w:p>
-        </w:tc>
-        <w:tc>
-          <w:tcPr/>
-          <w:p>
-            <w:pPr>
-              <w:pStyle w:val="Compact"/>
-              <w:jc w:val="right"/>
-            </w:pPr>
-            <w:r>
-              <w:t xml:space="preserve">23.79 ± 1.00</w:t>
-            </w:r>
-          </w:p>
-        </w:tc>
-        <w:tc>
-          <w:tcPr/>
-          <w:p>
-            <w:pPr>
-              <w:pStyle w:val="Compact"/>
-              <w:jc w:val="right"/>
-            </w:pPr>
-            <w:r>
-              <w:t xml:space="preserve">-23.58 ± 1.00</w:t>
-            </w:r>
-          </w:p>
-        </w:tc>
-      </w:tr>
-      <w:tr>
-        <w:tc>
-          <w:tcPr/>
-          <w:p>
-            <w:pPr>
-              <w:pStyle w:val="Compact"/>
-            </w:pPr>
-            <w:r>
-              <w:rPr>
-                <w:b/>
-                <w:bCs/>
-              </w:rPr>
-              <w:t xml:space="preserve">Z985612796</w:t>
-            </w:r>
-          </w:p>
-        </w:tc>
-        <w:tc>
-          <w:tcPr/>
-          <w:p>
-            <w:pPr>
-              <w:pStyle w:val="Compact"/>
-              <w:jc w:val="right"/>
-            </w:pPr>
-            <w:r>
-              <w:t xml:space="preserve">-40.68 ± 0.81</w:t>
-            </w:r>
-          </w:p>
-        </w:tc>
-        <w:tc>
-          <w:tcPr/>
-          <w:p>
-            <w:pPr>
-              <w:pStyle w:val="Compact"/>
-              <w:jc w:val="right"/>
-            </w:pPr>
-            <w:r>
-              <w:t xml:space="preserve">-18.35 ± 0.42</w:t>
-            </w:r>
-          </w:p>
-        </w:tc>
-        <w:tc>
-          <w:tcPr/>
-          <w:p>
-            <w:pPr>
-              <w:pStyle w:val="Compact"/>
-              <w:jc w:val="right"/>
-            </w:pPr>
-            <w:r>
-              <w:t xml:space="preserve">33.48 ± 0.68</w:t>
-            </w:r>
-          </w:p>
-        </w:tc>
-        <w:tc>
-          <w:tcPr/>
-          <w:p>
-            <w:pPr>
-              <w:pStyle w:val="Compact"/>
-              <w:jc w:val="right"/>
-            </w:pPr>
-            <w:r>
-              <w:t xml:space="preserve">-5.15 ± 0.10</w:t>
-            </w:r>
-          </w:p>
-        </w:tc>
-        <w:tc>
-          <w:tcPr/>
-          <w:p>
-            <w:pPr>
-              <w:pStyle w:val="Compact"/>
-              <w:jc w:val="right"/>
-            </w:pPr>
-            <w:r>
-              <w:t xml:space="preserve">-59.03 ± 1.19</w:t>
-            </w:r>
-          </w:p>
-        </w:tc>
-        <w:tc>
-          <w:tcPr/>
-          <w:p>
-            <w:pPr>
-              <w:pStyle w:val="Compact"/>
-              <w:jc w:val="right"/>
-            </w:pPr>
-            <w:r>
-              <w:t xml:space="preserve">28.33 ± 0.58</w:t>
-            </w:r>
-          </w:p>
-        </w:tc>
-        <w:tc>
-          <w:tcPr/>
-          <w:p>
-            <w:pPr>
-              <w:pStyle w:val="Compact"/>
-              <w:jc w:val="right"/>
-            </w:pPr>
-            <w:r>
-              <w:t xml:space="preserve">-30.70 ± 0.63</w:t>
-            </w:r>
-          </w:p>
+          <w:tbl>
+            <w:tblPr>
+              <w:tblStyle w:val="Table"/>
+              <w:tblW w:type="pct" w:w="5000"/>
+              <w:tblLayout w:type="fixed"/>
+              <w:tblLook w:firstRow="1" w:lastRow="0" w:firstColumn="0" w:lastColumn="0" w:noHBand="0" w:noVBand="0" w:val="0020"/>
+            </w:tblPr>
+            <w:tblGrid>
+              <w:gridCol w:w="766"/>
+              <w:gridCol w:w="1021"/>
+              <w:gridCol w:w="1021"/>
+              <w:gridCol w:w="1021"/>
+              <w:gridCol w:w="1021"/>
+              <w:gridCol w:w="1021"/>
+              <w:gridCol w:w="1021"/>
+              <w:gridCol w:w="1021"/>
+            </w:tblGrid>
+            <w:tr>
+              <w:trPr>
+                <w:tblHeader w:val="on"/>
+              </w:trPr>
+              <w:tc>
+                <w:tcPr/>
+                <w:p>
+                  <w:pPr>
+                    <w:pStyle w:val="Compact"/>
+                    <w:jc w:val="center"/>
+                  </w:pPr>
+                  <w:r>
+                    <w:rPr>
+                      <w:b/>
+                      <w:bCs/>
+                    </w:rPr>
+                    <w:t xml:space="preserve">Ligand</w:t>
+                  </w:r>
+                </w:p>
+              </w:tc>
+              <w:tc>
+                <w:tcPr/>
+                <w:p>
+                  <w:pPr>
+                    <w:pStyle w:val="Compact"/>
+                    <w:jc w:val="right"/>
+                    <w:jc w:val="center"/>
+                  </w:pPr>
+                  <w:r>
+                    <w:rPr>
+                      <w:b/>
+                      <w:bCs/>
+                    </w:rPr>
+                    <w:t xml:space="preserve">ΔE</w:t>
+                  </w:r>
+                  <w:r>
+                    <w:rPr>
+                      <w:b/>
+                      <w:bCs/>
+                    </w:rPr>
+                    <w:t xml:space="preserve">VDW</w:t>
+                  </w:r>
+                </w:p>
+              </w:tc>
+              <w:tc>
+                <w:tcPr/>
+                <w:p>
+                  <w:pPr>
+                    <w:pStyle w:val="Compact"/>
+                    <w:jc w:val="right"/>
+                    <w:jc w:val="center"/>
+                  </w:pPr>
+                  <w:r>
+                    <w:rPr>
+                      <w:b/>
+                      <w:bCs/>
+                    </w:rPr>
+                    <w:t xml:space="preserve">ΔE</w:t>
+                  </w:r>
+                  <w:r>
+                    <w:rPr>
+                      <w:b/>
+                      <w:bCs/>
+                    </w:rPr>
+                    <w:t xml:space="preserve">ELE</w:t>
+                  </w:r>
+                </w:p>
+              </w:tc>
+              <w:tc>
+                <w:tcPr/>
+                <w:p>
+                  <w:pPr>
+                    <w:pStyle w:val="Compact"/>
+                    <w:jc w:val="right"/>
+                    <w:jc w:val="center"/>
+                  </w:pPr>
+                  <w:r>
+                    <w:rPr>
+                      <w:b/>
+                      <w:bCs/>
+                    </w:rPr>
+                    <w:t xml:space="preserve">ΔE</w:t>
+                  </w:r>
+                  <w:r>
+                    <w:rPr>
+                      <w:b/>
+                      <w:bCs/>
+                    </w:rPr>
+                    <w:t xml:space="preserve">GB</w:t>
+                  </w:r>
+                </w:p>
+              </w:tc>
+              <w:tc>
+                <w:tcPr/>
+                <w:p>
+                  <w:pPr>
+                    <w:pStyle w:val="Compact"/>
+                    <w:jc w:val="right"/>
+                    <w:jc w:val="center"/>
+                  </w:pPr>
+                  <w:r>
+                    <w:rPr>
+                      <w:b/>
+                      <w:bCs/>
+                    </w:rPr>
+                    <w:t xml:space="preserve">ΔE</w:t>
+                  </w:r>
+                  <w:r>
+                    <w:rPr>
+                      <w:b/>
+                      <w:bCs/>
+                    </w:rPr>
+                    <w:t xml:space="preserve">SURF</w:t>
+                  </w:r>
+                </w:p>
+              </w:tc>
+              <w:tc>
+                <w:tcPr/>
+                <w:p>
+                  <w:pPr>
+                    <w:pStyle w:val="Compact"/>
+                    <w:jc w:val="right"/>
+                    <w:jc w:val="center"/>
+                  </w:pPr>
+                  <w:r>
+                    <w:rPr>
+                      <w:b/>
+                      <w:bCs/>
+                    </w:rPr>
+                    <w:t xml:space="preserve">ΔG</w:t>
+                  </w:r>
+                  <w:r>
+                    <w:rPr>
+                      <w:b/>
+                      <w:bCs/>
+                    </w:rPr>
+                    <w:t xml:space="preserve">GAS</w:t>
+                  </w:r>
+                </w:p>
+              </w:tc>
+              <w:tc>
+                <w:tcPr/>
+                <w:p>
+                  <w:pPr>
+                    <w:pStyle w:val="Compact"/>
+                    <w:jc w:val="right"/>
+                    <w:jc w:val="center"/>
+                  </w:pPr>
+                  <w:r>
+                    <w:rPr>
+                      <w:b/>
+                      <w:bCs/>
+                    </w:rPr>
+                    <w:t xml:space="preserve">ΔG</w:t>
+                  </w:r>
+                  <w:r>
+                    <w:rPr>
+                      <w:b/>
+                      <w:bCs/>
+                    </w:rPr>
+                    <w:t xml:space="preserve">SOLV</w:t>
+                  </w:r>
+                </w:p>
+              </w:tc>
+              <w:tc>
+                <w:tcPr/>
+                <w:p>
+                  <w:pPr>
+                    <w:pStyle w:val="Compact"/>
+                    <w:jc w:val="right"/>
+                    <w:jc w:val="center"/>
+                  </w:pPr>
+                  <w:r>
+                    <w:rPr>
+                      <w:b/>
+                      <w:bCs/>
+                    </w:rPr>
+                    <w:t xml:space="preserve">ΔG</w:t>
+                  </w:r>
+                  <w:r>
+                    <w:rPr>
+                      <w:b/>
+                      <w:bCs/>
+                    </w:rPr>
+                    <w:t xml:space="preserve">MM/GBSA</w:t>
+                  </w:r>
+                </w:p>
+              </w:tc>
+            </w:tr>
+            <w:tr>
+              <w:tc>
+                <w:tcPr/>
+                <w:p>
+                  <w:pPr>
+                    <w:pStyle w:val="Compact"/>
+                    <w:jc w:val="center"/>
+                  </w:pPr>
+                  <w:r>
+                    <w:rPr>
+                      <w:b/>
+                      <w:bCs/>
+                    </w:rPr>
+                    <w:t xml:space="preserve">I5K</w:t>
+                  </w:r>
+                </w:p>
+              </w:tc>
+              <w:tc>
+                <w:tcPr/>
+                <w:p>
+                  <w:pPr>
+                    <w:pStyle w:val="Compact"/>
+                    <w:jc w:val="right"/>
+                    <w:jc w:val="center"/>
+                  </w:pPr>
+                  <w:r>
+                    <w:t xml:space="preserve">-14.59 ± 0.64</w:t>
+                  </w:r>
+                </w:p>
+              </w:tc>
+              <w:tc>
+                <w:tcPr/>
+                <w:p>
+                  <w:pPr>
+                    <w:pStyle w:val="Compact"/>
+                    <w:jc w:val="right"/>
+                    <w:jc w:val="center"/>
+                  </w:pPr>
+                  <w:r>
+                    <w:t xml:space="preserve">-9.94 ± 0.45</w:t>
+                  </w:r>
+                </w:p>
+              </w:tc>
+              <w:tc>
+                <w:tcPr/>
+                <w:p>
+                  <w:pPr>
+                    <w:pStyle w:val="Compact"/>
+                    <w:jc w:val="right"/>
+                    <w:jc w:val="center"/>
+                  </w:pPr>
+                  <w:r>
+                    <w:t xml:space="preserve">14.10 ± 0.60</w:t>
+                  </w:r>
+                </w:p>
+              </w:tc>
+              <w:tc>
+                <w:tcPr/>
+                <w:p>
+                  <w:pPr>
+                    <w:pStyle w:val="Compact"/>
+                    <w:jc w:val="right"/>
+                    <w:jc w:val="center"/>
+                  </w:pPr>
+                  <w:r>
+                    <w:t xml:space="preserve">-2.22 ± 0.10</w:t>
+                  </w:r>
+                </w:p>
+              </w:tc>
+              <w:tc>
+                <w:tcPr/>
+                <w:p>
+                  <w:pPr>
+                    <w:pStyle w:val="Compact"/>
+                    <w:jc w:val="right"/>
+                    <w:jc w:val="center"/>
+                  </w:pPr>
+                  <w:r>
+                    <w:t xml:space="preserve">-24.53 ± 1.06</w:t>
+                  </w:r>
+                </w:p>
+              </w:tc>
+              <w:tc>
+                <w:tcPr/>
+                <w:p>
+                  <w:pPr>
+                    <w:pStyle w:val="Compact"/>
+                    <w:jc w:val="right"/>
+                    <w:jc w:val="center"/>
+                  </w:pPr>
+                  <w:r>
+                    <w:t xml:space="preserve">11.88 ± 0.51</w:t>
+                  </w:r>
+                </w:p>
+              </w:tc>
+              <w:tc>
+                <w:tcPr/>
+                <w:p>
+                  <w:pPr>
+                    <w:pStyle w:val="Compact"/>
+                    <w:jc w:val="right"/>
+                    <w:jc w:val="center"/>
+                  </w:pPr>
+                  <w:r>
+                    <w:t xml:space="preserve">-12.65 ± 0.56</w:t>
+                  </w:r>
+                </w:p>
+              </w:tc>
+            </w:tr>
+            <w:tr>
+              <w:tc>
+                <w:tcPr/>
+                <w:p>
+                  <w:pPr>
+                    <w:pStyle w:val="Compact"/>
+                    <w:jc w:val="center"/>
+                  </w:pPr>
+                  <w:r>
+                    <w:rPr>
+                      <w:b/>
+                      <w:bCs/>
+                    </w:rPr>
+                    <w:t xml:space="preserve">Z1723441401</w:t>
+                  </w:r>
+                </w:p>
+              </w:tc>
+              <w:tc>
+                <w:tcPr/>
+                <w:p>
+                  <w:pPr>
+                    <w:pStyle w:val="Compact"/>
+                    <w:jc w:val="right"/>
+                    <w:jc w:val="center"/>
+                  </w:pPr>
+                  <w:r>
+                    <w:t xml:space="preserve">-31.59 ± 1.11</w:t>
+                  </w:r>
+                </w:p>
+              </w:tc>
+              <w:tc>
+                <w:tcPr/>
+                <w:p>
+                  <w:pPr>
+                    <w:pStyle w:val="Compact"/>
+                    <w:jc w:val="right"/>
+                    <w:jc w:val="center"/>
+                  </w:pPr>
+                  <w:r>
+                    <w:t xml:space="preserve">-16.02 ± 0.62</w:t>
+                  </w:r>
+                </w:p>
+              </w:tc>
+              <w:tc>
+                <w:tcPr/>
+                <w:p>
+                  <w:pPr>
+                    <w:pStyle w:val="Compact"/>
+                    <w:jc w:val="right"/>
+                    <w:jc w:val="center"/>
+                  </w:pPr>
+                  <w:r>
+                    <w:t xml:space="preserve">26.67 ± 0.96</w:t>
+                  </w:r>
+                </w:p>
+              </w:tc>
+              <w:tc>
+                <w:tcPr/>
+                <w:p>
+                  <w:pPr>
+                    <w:pStyle w:val="Compact"/>
+                    <w:jc w:val="right"/>
+                    <w:jc w:val="center"/>
+                  </w:pPr>
+                  <w:r>
+                    <w:t xml:space="preserve">-4.00 ± 0.14</w:t>
+                  </w:r>
+                </w:p>
+              </w:tc>
+              <w:tc>
+                <w:tcPr/>
+                <w:p>
+                  <w:pPr>
+                    <w:pStyle w:val="Compact"/>
+                    <w:jc w:val="right"/>
+                    <w:jc w:val="center"/>
+                  </w:pPr>
+                  <w:r>
+                    <w:t xml:space="preserve">-47.60 ± 1.70</w:t>
+                  </w:r>
+                </w:p>
+              </w:tc>
+              <w:tc>
+                <w:tcPr/>
+                <w:p>
+                  <w:pPr>
+                    <w:pStyle w:val="Compact"/>
+                    <w:jc w:val="right"/>
+                    <w:jc w:val="center"/>
+                  </w:pPr>
+                  <w:r>
+                    <w:t xml:space="preserve">22.67 ± 0.82</w:t>
+                  </w:r>
+                </w:p>
+              </w:tc>
+              <w:tc>
+                <w:tcPr/>
+                <w:p>
+                  <w:pPr>
+                    <w:pStyle w:val="Compact"/>
+                    <w:jc w:val="right"/>
+                    <w:jc w:val="center"/>
+                  </w:pPr>
+                  <w:r>
+                    <w:t xml:space="preserve">-24.93 ± 0.89</w:t>
+                  </w:r>
+                </w:p>
+              </w:tc>
+            </w:tr>
+            <w:tr>
+              <w:tc>
+                <w:tcPr/>
+                <w:p>
+                  <w:pPr>
+                    <w:pStyle w:val="Compact"/>
+                    <w:jc w:val="center"/>
+                  </w:pPr>
+                  <w:r>
+                    <w:rPr>
+                      <w:b/>
+                      <w:bCs/>
+                    </w:rPr>
+                    <w:t xml:space="preserve">Z31277728</w:t>
+                  </w:r>
+                </w:p>
+              </w:tc>
+              <w:tc>
+                <w:tcPr/>
+                <w:p>
+                  <w:pPr>
+                    <w:pStyle w:val="Compact"/>
+                    <w:jc w:val="right"/>
+                    <w:jc w:val="center"/>
+                  </w:pPr>
+                  <w:r>
+                    <w:t xml:space="preserve">-34.49 ± 1.37</w:t>
+                  </w:r>
+                </w:p>
+              </w:tc>
+              <w:tc>
+                <w:tcPr/>
+                <w:p>
+                  <w:pPr>
+                    <w:pStyle w:val="Compact"/>
+                    <w:jc w:val="right"/>
+                    <w:jc w:val="center"/>
+                  </w:pPr>
+                  <w:r>
+                    <w:t xml:space="preserve">-10.35 ± 0.51</w:t>
+                  </w:r>
+                </w:p>
+              </w:tc>
+              <w:tc>
+                <w:tcPr/>
+                <w:p>
+                  <w:pPr>
+                    <w:pStyle w:val="Compact"/>
+                    <w:jc w:val="right"/>
+                    <w:jc w:val="center"/>
+                  </w:pPr>
+                  <w:r>
+                    <w:t xml:space="preserve">27.15 ± 1.11</w:t>
+                  </w:r>
+                </w:p>
+              </w:tc>
+              <w:tc>
+                <w:tcPr/>
+                <w:p>
+                  <w:pPr>
+                    <w:pStyle w:val="Compact"/>
+                    <w:jc w:val="right"/>
+                    <w:jc w:val="center"/>
+                  </w:pPr>
+                  <w:r>
+                    <w:t xml:space="preserve">-4.44 ± 0.18</w:t>
+                  </w:r>
+                </w:p>
+              </w:tc>
+              <w:tc>
+                <w:tcPr/>
+                <w:p>
+                  <w:pPr>
+                    <w:pStyle w:val="Compact"/>
+                    <w:jc w:val="right"/>
+                    <w:jc w:val="center"/>
+                  </w:pPr>
+                  <w:r>
+                    <w:t xml:space="preserve">-44.84 ± 1.83</w:t>
+                  </w:r>
+                </w:p>
+              </w:tc>
+              <w:tc>
+                <w:tcPr/>
+                <w:p>
+                  <w:pPr>
+                    <w:pStyle w:val="Compact"/>
+                    <w:jc w:val="right"/>
+                    <w:jc w:val="center"/>
+                  </w:pPr>
+                  <w:r>
+                    <w:t xml:space="preserve">22.70 ± 0.94</w:t>
+                  </w:r>
+                </w:p>
+              </w:tc>
+              <w:tc>
+                <w:tcPr/>
+                <w:p>
+                  <w:pPr>
+                    <w:pStyle w:val="Compact"/>
+                    <w:jc w:val="right"/>
+                    <w:jc w:val="center"/>
+                  </w:pPr>
+                  <w:r>
+                    <w:t xml:space="preserve">-22.13 ± 0.90</w:t>
+                  </w:r>
+                </w:p>
+              </w:tc>
+            </w:tr>
+            <w:tr>
+              <w:tc>
+                <w:tcPr/>
+                <w:p>
+                  <w:pPr>
+                    <w:pStyle w:val="Compact"/>
+                    <w:jc w:val="center"/>
+                  </w:pPr>
+                  <w:r>
+                    <w:rPr>
+                      <w:b/>
+                      <w:bCs/>
+                    </w:rPr>
+                    <w:t xml:space="preserve">Z9033488415</w:t>
+                  </w:r>
+                </w:p>
+              </w:tc>
+              <w:tc>
+                <w:tcPr/>
+                <w:p>
+                  <w:pPr>
+                    <w:pStyle w:val="Compact"/>
+                    <w:jc w:val="right"/>
+                    <w:jc w:val="center"/>
+                  </w:pPr>
+                  <w:r>
+                    <w:t xml:space="preserve">-28.96 ± 1.26</w:t>
+                  </w:r>
+                </w:p>
+              </w:tc>
+              <w:tc>
+                <w:tcPr/>
+                <w:p>
+                  <w:pPr>
+                    <w:pStyle w:val="Compact"/>
+                    <w:jc w:val="right"/>
+                    <w:jc w:val="center"/>
+                  </w:pPr>
+                  <w:r>
+                    <w:t xml:space="preserve">12.85 ± 0.84</w:t>
+                  </w:r>
+                </w:p>
+              </w:tc>
+              <w:tc>
+                <w:tcPr/>
+                <w:p>
+                  <w:pPr>
+                    <w:pStyle w:val="Compact"/>
+                    <w:jc w:val="right"/>
+                    <w:jc w:val="center"/>
+                  </w:pPr>
+                  <w:r>
+                    <w:t xml:space="preserve">4.86 ± 1.46</w:t>
+                  </w:r>
+                </w:p>
+              </w:tc>
+              <w:tc>
+                <w:tcPr/>
+                <w:p>
+                  <w:pPr>
+                    <w:pStyle w:val="Compact"/>
+                    <w:jc w:val="right"/>
+                    <w:jc w:val="center"/>
+                  </w:pPr>
+                  <w:r>
+                    <w:t xml:space="preserve">-3.59 ± 0.16</w:t>
+                  </w:r>
+                </w:p>
+              </w:tc>
+              <w:tc>
+                <w:tcPr/>
+                <w:p>
+                  <w:pPr>
+                    <w:pStyle w:val="Compact"/>
+                    <w:jc w:val="right"/>
+                    <w:jc w:val="center"/>
+                  </w:pPr>
+                  <w:r>
+                    <w:t xml:space="preserve">-16.11 ± 1.92</w:t>
+                  </w:r>
+                </w:p>
+              </w:tc>
+              <w:tc>
+                <w:tcPr/>
+                <w:p>
+                  <w:pPr>
+                    <w:pStyle w:val="Compact"/>
+                    <w:jc w:val="right"/>
+                    <w:jc w:val="center"/>
+                  </w:pPr>
+                  <w:r>
+                    <w:t xml:space="preserve">1.27 ± 1.32</w:t>
+                  </w:r>
+                </w:p>
+              </w:tc>
+              <w:tc>
+                <w:tcPr/>
+                <w:p>
+                  <w:pPr>
+                    <w:pStyle w:val="Compact"/>
+                    <w:jc w:val="right"/>
+                    <w:jc w:val="center"/>
+                  </w:pPr>
+                  <w:r>
+                    <w:t xml:space="preserve">-14.85 ± 0.66</w:t>
+                  </w:r>
+                </w:p>
+              </w:tc>
+            </w:tr>
+            <w:tr>
+              <w:tc>
+                <w:tcPr/>
+                <w:p>
+                  <w:pPr>
+                    <w:pStyle w:val="Compact"/>
+                    <w:jc w:val="center"/>
+                  </w:pPr>
+                  <w:r>
+                    <w:rPr>
+                      <w:b/>
+                      <w:bCs/>
+                    </w:rPr>
+                    <w:t xml:space="preserve">Z9302730850</w:t>
+                  </w:r>
+                </w:p>
+              </w:tc>
+              <w:tc>
+                <w:tcPr/>
+                <w:p>
+                  <w:pPr>
+                    <w:pStyle w:val="Compact"/>
+                    <w:jc w:val="right"/>
+                    <w:jc w:val="center"/>
+                  </w:pPr>
+                  <w:r>
+                    <w:t xml:space="preserve">-28.75 ± 1.21</w:t>
+                  </w:r>
+                </w:p>
+              </w:tc>
+              <w:tc>
+                <w:tcPr/>
+                <w:p>
+                  <w:pPr>
+                    <w:pStyle w:val="Compact"/>
+                    <w:jc w:val="right"/>
+                    <w:jc w:val="center"/>
+                  </w:pPr>
+                  <w:r>
+                    <w:t xml:space="preserve">-18.63 ± 0.81</w:t>
+                  </w:r>
+                </w:p>
+              </w:tc>
+              <w:tc>
+                <w:tcPr/>
+                <w:p>
+                  <w:pPr>
+                    <w:pStyle w:val="Compact"/>
+                    <w:jc w:val="right"/>
+                    <w:jc w:val="center"/>
+                  </w:pPr>
+                  <w:r>
+                    <w:t xml:space="preserve">27.43 ± 1.15</w:t>
+                  </w:r>
+                </w:p>
+              </w:tc>
+              <w:tc>
+                <w:tcPr/>
+                <w:p>
+                  <w:pPr>
+                    <w:pStyle w:val="Compact"/>
+                    <w:jc w:val="right"/>
+                    <w:jc w:val="center"/>
+                  </w:pPr>
+                  <w:r>
+                    <w:t xml:space="preserve">-3.64 ± 0.15</w:t>
+                  </w:r>
+                </w:p>
+              </w:tc>
+              <w:tc>
+                <w:tcPr/>
+                <w:p>
+                  <w:pPr>
+                    <w:pStyle w:val="Compact"/>
+                    <w:jc w:val="right"/>
+                    <w:jc w:val="center"/>
+                  </w:pPr>
+                  <w:r>
+                    <w:t xml:space="preserve">-47.37 ± 1.99</w:t>
+                  </w:r>
+                </w:p>
+              </w:tc>
+              <w:tc>
+                <w:tcPr/>
+                <w:p>
+                  <w:pPr>
+                    <w:pStyle w:val="Compact"/>
+                    <w:jc w:val="right"/>
+                    <w:jc w:val="center"/>
+                  </w:pPr>
+                  <w:r>
+                    <w:t xml:space="preserve">23.79 ± 1.00</w:t>
+                  </w:r>
+                </w:p>
+              </w:tc>
+              <w:tc>
+                <w:tcPr/>
+                <w:p>
+                  <w:pPr>
+                    <w:pStyle w:val="Compact"/>
+                    <w:jc w:val="right"/>
+                    <w:jc w:val="center"/>
+                  </w:pPr>
+                  <w:r>
+                    <w:t xml:space="preserve">-23.58 ± 1.00</w:t>
+                  </w:r>
+                </w:p>
+              </w:tc>
+            </w:tr>
+            <w:tr>
+              <w:tc>
+                <w:tcPr/>
+                <w:p>
+                  <w:pPr>
+                    <w:pStyle w:val="Compact"/>
+                    <w:jc w:val="center"/>
+                  </w:pPr>
+                  <w:r>
+                    <w:rPr>
+                      <w:b/>
+                      <w:bCs/>
+                    </w:rPr>
+                    <w:t xml:space="preserve">Z985612796</w:t>
+                  </w:r>
+                </w:p>
+              </w:tc>
+              <w:tc>
+                <w:tcPr/>
+                <w:p>
+                  <w:pPr>
+                    <w:pStyle w:val="Compact"/>
+                    <w:jc w:val="right"/>
+                    <w:jc w:val="center"/>
+                  </w:pPr>
+                  <w:r>
+                    <w:t xml:space="preserve">-40.68 ± 0.81</w:t>
+                  </w:r>
+                </w:p>
+              </w:tc>
+              <w:tc>
+                <w:tcPr/>
+                <w:p>
+                  <w:pPr>
+                    <w:pStyle w:val="Compact"/>
+                    <w:jc w:val="right"/>
+                    <w:jc w:val="center"/>
+                  </w:pPr>
+                  <w:r>
+                    <w:t xml:space="preserve">-18.35 ± 0.42</w:t>
+                  </w:r>
+                </w:p>
+              </w:tc>
+              <w:tc>
+                <w:tcPr/>
+                <w:p>
+                  <w:pPr>
+                    <w:pStyle w:val="Compact"/>
+                    <w:jc w:val="right"/>
+                    <w:jc w:val="center"/>
+                  </w:pPr>
+                  <w:r>
+                    <w:t xml:space="preserve">33.48 ± 0.68</w:t>
+                  </w:r>
+                </w:p>
+              </w:tc>
+              <w:tc>
+                <w:tcPr/>
+                <w:p>
+                  <w:pPr>
+                    <w:pStyle w:val="Compact"/>
+                    <w:jc w:val="right"/>
+                    <w:jc w:val="center"/>
+                  </w:pPr>
+                  <w:r>
+                    <w:t xml:space="preserve">-5.15 ± 0.10</w:t>
+                  </w:r>
+                </w:p>
+              </w:tc>
+              <w:tc>
+                <w:tcPr/>
+                <w:p>
+                  <w:pPr>
+                    <w:pStyle w:val="Compact"/>
+                    <w:jc w:val="right"/>
+                    <w:jc w:val="center"/>
+                  </w:pPr>
+                  <w:r>
+                    <w:t xml:space="preserve">-59.03 ± 1.19</w:t>
+                  </w:r>
+                </w:p>
+              </w:tc>
+              <w:tc>
+                <w:tcPr/>
+                <w:p>
+                  <w:pPr>
+                    <w:pStyle w:val="Compact"/>
+                    <w:jc w:val="right"/>
+                    <w:jc w:val="center"/>
+                  </w:pPr>
+                  <w:r>
+                    <w:t xml:space="preserve">28.33 ± 0.58</w:t>
+                  </w:r>
+                </w:p>
+              </w:tc>
+              <w:tc>
+                <w:tcPr/>
+                <w:p>
+                  <w:pPr>
+                    <w:pStyle w:val="Compact"/>
+                    <w:jc w:val="right"/>
+                    <w:jc w:val="center"/>
+                  </w:pPr>
+                  <w:r>
+                    <w:t xml:space="preserve">-30.70 ± 0.63</w:t>
+                  </w:r>
+                </w:p>
+              </w:tc>
+            </w:tr>
+          </w:tbl>
+          <w:bookmarkEnd w:id="39"/>
+          <w:p/>
         </w:tc>
       </w:tr>
     </w:tbl>
@@ -3333,7 +3650,24 @@
         <w:t xml:space="preserve"> </w:t>
       </w:r>
       <w:r>
-        <w:t xml:space="preserve">Z9033488415 yielded an estimate of −14.85 ± 0.66 kcal/mol.</w:t>
+        <w:t xml:space="preserve">Z9033488415 yielded an estimate of −14.85 ± 0.66 kcal/mol</w:t>
+      </w:r>
+      <w:r>
+        <w:t xml:space="preserve"> </w:t>
+      </w:r>
+      <w:r>
+        <w:t xml:space="preserve">(</w:t>
+      </w:r>
+      <w:hyperlink w:anchor="tbl-mmgbsa">
+        <w:r>
+          <w:rPr>
+            <w:rStyle w:val="Hyperlink"/>
+          </w:rPr>
+          <w:t xml:space="preserve">Table 1</w:t>
+        </w:r>
+      </w:hyperlink>
+      <w:r>
+        <w:t xml:space="preserve">).</w:t>
       </w:r>
     </w:p>
     <w:p>
@@ -3359,7 +3693,18 @@
         <w:t xml:space="preserve"> </w:t>
       </w:r>
       <w:r>
-        <w:t xml:space="preserve">contribution of +12.85 kcal/mol.</w:t>
+        <w:t xml:space="preserve">contribution of +12.85 kcal/mol (</w:t>
+      </w:r>
+      <w:hyperlink w:anchor="tbl-mmgbsa">
+        <w:r>
+          <w:rPr>
+            <w:rStyle w:val="Hyperlink"/>
+          </w:rPr>
+          <w:t xml:space="preserve">Table 1</w:t>
+        </w:r>
+      </w:hyperlink>
+      <w:r>
+        <w:t xml:space="preserve">).</w:t>
       </w:r>
     </w:p>
     <w:p>
@@ -3391,7 +3736,18 @@
         <w:t xml:space="preserve"> </w:t>
       </w:r>
       <w:r>
-        <w:t xml:space="preserve">largest mean hydrogen-bond network.</w:t>
+        <w:t xml:space="preserve">largest mean hydrogen-bond network (</w:t>
+      </w:r>
+      <w:hyperlink w:anchor="tbl-mmgbsa">
+        <w:r>
+          <w:rPr>
+            <w:rStyle w:val="Hyperlink"/>
+          </w:rPr>
+          <w:t xml:space="preserve">Table 1</w:t>
+        </w:r>
+      </w:hyperlink>
+      <w:r>
+        <w:t xml:space="preserve">).</w:t>
       </w:r>
     </w:p>
     <w:p>
@@ -3441,12 +3797,23 @@
         <w:t xml:space="preserve"> </w:t>
       </w:r>
       <w:r>
-        <w:t xml:space="preserve">than experimental binding free energies.</w:t>
-      </w:r>
-    </w:p>
-    <w:bookmarkEnd w:id="39"/>
+        <w:t xml:space="preserve">than experimental binding free energies (</w:t>
+      </w:r>
+      <w:hyperlink w:anchor="tbl-mmgbsa">
+        <w:r>
+          <w:rPr>
+            <w:rStyle w:val="Hyperlink"/>
+          </w:rPr>
+          <w:t xml:space="preserve">Table 1</w:t>
+        </w:r>
+      </w:hyperlink>
+      <w:r>
+        <w:t xml:space="preserve">).</w:t>
+      </w:r>
+    </w:p>
     <w:bookmarkEnd w:id="40"/>
-    <w:bookmarkStart w:id="41" w:name="X85299cc7c2f9fb62910d909b131ab350587d560"/>
+    <w:bookmarkEnd w:id="41"/>
+    <w:bookmarkStart w:id="42" w:name="X85299cc7c2f9fb62910d909b131ab350587d560"/>
     <w:p>
       <w:pPr>
         <w:pStyle w:val="Heading2"/>
@@ -3483,7 +3850,18 @@
         <w:t xml:space="preserve"> </w:t>
       </w:r>
       <w:r>
-        <w:t xml:space="preserve">profiles. Z1723441401 had</w:t>
+        <w:t xml:space="preserve">profiles (</w:t>
+      </w:r>
+      <w:hyperlink w:anchor="dat-admet-profiles">
+        <w:r>
+          <w:rPr>
+            <w:rStyle w:val="Hyperlink"/>
+          </w:rPr>
+          <w:t xml:space="preserve">Supplementary Data S2</w:t>
+        </w:r>
+      </w:hyperlink>
+      <w:r>
+        <w:t xml:space="preserve">). Z1723441401 had</w:t>
       </w:r>
       <w:r>
         <w:t xml:space="preserve"> </w:t>
@@ -3539,7 +3917,24 @@
         <w:t xml:space="preserve"> </w:t>
       </w:r>
       <w:r>
-        <w:t xml:space="preserve">respectively. CYP-inhibition probabilities ranged from 0.092 to 0.671.</w:t>
+        <w:t xml:space="preserve">respectively. CYP-inhibition probabilities ranged from 0.092 to 0.671</w:t>
+      </w:r>
+      <w:r>
+        <w:t xml:space="preserve"> </w:t>
+      </w:r>
+      <w:r>
+        <w:t xml:space="preserve">(</w:t>
+      </w:r>
+      <w:hyperlink w:anchor="dat-admet-profiles">
+        <w:r>
+          <w:rPr>
+            <w:rStyle w:val="Hyperlink"/>
+          </w:rPr>
+          <w:t xml:space="preserve">Supplementary Data S2</w:t>
+        </w:r>
+      </w:hyperlink>
+      <w:r>
+        <w:t xml:space="preserve">).</w:t>
       </w:r>
     </w:p>
     <w:p>
@@ -3565,7 +3960,24 @@
         <w:t xml:space="preserve"> </w:t>
       </w:r>
       <w:r>
-        <w:t xml:space="preserve">hERG (0.976), P-glycoprotein (0.969), and CYP3A4 (0.929) signals.</w:t>
+        <w:t xml:space="preserve">hERG (0.976), P-glycoprotein (0.969), and CYP3A4 (0.929) signals</w:t>
+      </w:r>
+      <w:r>
+        <w:t xml:space="preserve"> </w:t>
+      </w:r>
+      <w:r>
+        <w:t xml:space="preserve">(</w:t>
+      </w:r>
+      <w:hyperlink w:anchor="dat-admet-profiles">
+        <w:r>
+          <w:rPr>
+            <w:rStyle w:val="Hyperlink"/>
+          </w:rPr>
+          <w:t xml:space="preserve">Supplementary Data S2</w:t>
+        </w:r>
+      </w:hyperlink>
+      <w:r>
+        <w:t xml:space="preserve">).</w:t>
       </w:r>
       <w:r>
         <w:t xml:space="preserve"> </w:t>
@@ -3583,7 +3995,18 @@
         <w:t xml:space="preserve"> </w:t>
       </w:r>
       <w:r>
-        <w:t xml:space="preserve">0.644.</w:t>
+        <w:t xml:space="preserve">0.644 (</w:t>
+      </w:r>
+      <w:hyperlink w:anchor="dat-admet-profiles">
+        <w:r>
+          <w:rPr>
+            <w:rStyle w:val="Hyperlink"/>
+          </w:rPr>
+          <w:t xml:space="preserve">Supplementary Data S2</w:t>
+        </w:r>
+      </w:hyperlink>
+      <w:r>
+        <w:t xml:space="preserve">).</w:t>
       </w:r>
     </w:p>
     <w:p>
@@ -3627,7 +4050,18 @@
         <w:t xml:space="preserve"> </w:t>
       </w:r>
       <w:r>
-        <w:t xml:space="preserve">liabilities requiring experimental confirmation.</w:t>
+        <w:t xml:space="preserve">liabilities requiring experimental confirmation (</w:t>
+      </w:r>
+      <w:hyperlink w:anchor="dat-admet-profiles">
+        <w:r>
+          <w:rPr>
+            <w:rStyle w:val="Hyperlink"/>
+          </w:rPr>
+          <w:t xml:space="preserve">Supplementary Data S2</w:t>
+        </w:r>
+      </w:hyperlink>
+      <w:r>
+        <w:t xml:space="preserve">).</w:t>
       </w:r>
     </w:p>
     <w:p>
@@ -3641,19 +4075,53 @@
         <w:t xml:space="preserve"> </w:t>
       </w:r>
       <w:r>
-        <w:t xml:space="preserve">rankings. Z985612796 led the MD/MM/GBSA assessment but retained several</w:t>
-      </w:r>
-      <w:r>
-        <w:t xml:space="preserve"> </w:t>
-      </w:r>
-      <w:r>
-        <w:t xml:space="preserve">predicted safety and transport liabilities. Z1723441401 had a less favorable</w:t>
-      </w:r>
-      <w:r>
-        <w:t xml:space="preserve"> </w:t>
-      </w:r>
-      <w:r>
-        <w:t xml:space="preserve">endpoint binding-energy estimate but the most balanced overall ADMET profile.</w:t>
+        <w:t xml:space="preserve">rankings (</w:t>
+      </w:r>
+      <w:hyperlink w:anchor="tbl-mmgbsa">
+        <w:r>
+          <w:rPr>
+            <w:rStyle w:val="Hyperlink"/>
+          </w:rPr>
+          <w:t xml:space="preserve">Table 1</w:t>
+        </w:r>
+      </w:hyperlink>
+      <w:r>
+        <w:t xml:space="preserve"> </w:t>
+      </w:r>
+      <w:r>
+        <w:t xml:space="preserve">and</w:t>
+      </w:r>
+      <w:r>
+        <w:t xml:space="preserve"> </w:t>
+      </w:r>
+      <w:hyperlink w:anchor="dat-admet-profiles">
+        <w:r>
+          <w:rPr>
+            <w:rStyle w:val="Hyperlink"/>
+          </w:rPr>
+          <w:t xml:space="preserve">Supplementary Data S2</w:t>
+        </w:r>
+      </w:hyperlink>
+      <w:r>
+        <w:t xml:space="preserve">). Z985612796 led the MD/MM/GBSA</w:t>
+      </w:r>
+      <w:r>
+        <w:t xml:space="preserve"> </w:t>
+      </w:r>
+      <w:r>
+        <w:t xml:space="preserve">assessment but retained several predicted safety and transport liabilities.</w:t>
+      </w:r>
+      <w:r>
+        <w:t xml:space="preserve"> </w:t>
+      </w:r>
+      <w:r>
+        <w:t xml:space="preserve">Z1723441401 had a less favorable endpoint binding-energy estimate but the</w:t>
+      </w:r>
+      <w:r>
+        <w:t xml:space="preserve"> </w:t>
+      </w:r>
+      <w:r>
+        <w:t xml:space="preserve">most balanced overall ADMET profile.</w:t>
       </w:r>
       <w:r>
         <w:t xml:space="preserve"> </w:t>
@@ -3674,8 +4142,8 @@
         <w:t xml:space="preserve">estimates alone.</w:t>
       </w:r>
     </w:p>
-    <w:bookmarkEnd w:id="41"/>
-    <w:bookmarkStart w:id="101" w:name="study-limitations-and-next-steps"/>
+    <w:bookmarkEnd w:id="42"/>
+    <w:bookmarkStart w:id="43" w:name="study-limitations-and-next-steps"/>
     <w:p>
       <w:pPr>
         <w:pStyle w:val="Heading2"/>
@@ -3766,8 +4234,209 @@
         <w:t xml:space="preserve">I5K or the other candidates.</w:t>
       </w:r>
     </w:p>
-    <w:bookmarkStart w:id="100" w:name="refs"/>
-    <w:bookmarkStart w:id="43" w:name="ref-abrahamGROMACSHighPerformance2015"/>
+    <w:bookmarkEnd w:id="43"/>
+    <w:bookmarkEnd w:id="44"/>
+    <w:bookmarkStart w:id="45" w:name="conclusion"/>
+    <w:p>
+      <w:pPr>
+        <w:pStyle w:val="Heading1"/>
+      </w:pPr>
+      <w:r>
+        <w:t xml:space="preserve">4. Conclusion</w:t>
+      </w:r>
+    </w:p>
+    <w:p>
+      <w:pPr>
+        <w:pStyle w:val="FirstParagraph"/>
+      </w:pPr>
+      <w:r>
+        <w:t xml:space="preserve">This study screened 4,671,138 Enamine compounds against PfBDP1 and integrated</w:t>
+      </w:r>
+      <w:r>
+        <w:t xml:space="preserve"> </w:t>
+      </w:r>
+      <w:r>
+        <w:t xml:space="preserve">docking, molecular dynamics, MM/GBSA, and predicted ADMET evidence to</w:t>
+      </w:r>
+      <w:r>
+        <w:t xml:space="preserve"> </w:t>
+      </w:r>
+      <w:r>
+        <w:t xml:space="preserve">prioritize five candidates. Z985612796 emerged as the lead computational</w:t>
+      </w:r>
+      <w:r>
+        <w:t xml:space="preserve"> </w:t>
+      </w:r>
+      <w:r>
+        <w:t xml:space="preserve">binding candidate, combining stable pocket retention, persistent hydrogen</w:t>
+      </w:r>
+      <w:r>
+        <w:t xml:space="preserve"> </w:t>
+      </w:r>
+      <w:r>
+        <w:t xml:space="preserve">bonding, restricted conformational sampling, and the most negative endpoint</w:t>
+      </w:r>
+      <w:r>
+        <w:t xml:space="preserve"> </w:t>
+      </w:r>
+      <w:r>
+        <w:t xml:space="preserve">binding-energy estimate. However, its predicted safety and transport</w:t>
+      </w:r>
+      <w:r>
+        <w:t xml:space="preserve"> </w:t>
+      </w:r>
+      <w:r>
+        <w:t xml:space="preserve">liabilities, together with the use of a single trajectory per complex, make</w:t>
+      </w:r>
+      <w:r>
+        <w:t xml:space="preserve"> </w:t>
+      </w:r>
+      <w:r>
+        <w:t xml:space="preserve">this prioritization a testable hypothesis rather than evidence of efficacy.</w:t>
+      </w:r>
+      <w:r>
+        <w:t xml:space="preserve"> </w:t>
+      </w:r>
+      <w:r>
+        <w:t xml:space="preserve">Z1723441401 provides a complementary candidate with a more balanced predicted</w:t>
+      </w:r>
+      <w:r>
+        <w:t xml:space="preserve"> </w:t>
+      </w:r>
+      <w:r>
+        <w:t xml:space="preserve">ADMET profile. Next steps should include replicated, convergence-assessed</w:t>
+      </w:r>
+      <w:r>
+        <w:t xml:space="preserve"> </w:t>
+      </w:r>
+      <w:r>
+        <w:t xml:space="preserve">simulations; direct PfBDP1 binding measurements; biochemical and cellular</w:t>
+      </w:r>
+      <w:r>
+        <w:t xml:space="preserve"> </w:t>
+      </w:r>
+      <w:r>
+        <w:t xml:space="preserve">target-engagement assays; parasite growth-inhibition studies; and experimental</w:t>
+      </w:r>
+      <w:r>
+        <w:t xml:space="preserve"> </w:t>
+      </w:r>
+      <w:r>
+        <w:t xml:space="preserve">assessment of selectivity, cytotoxicity, and ADME properties. These studies</w:t>
+      </w:r>
+      <w:r>
+        <w:t xml:space="preserve"> </w:t>
+      </w:r>
+      <w:r>
+        <w:t xml:space="preserve">will determine whether Z985612796 warrants medicinal-chemistry optimization</w:t>
+      </w:r>
+      <w:r>
+        <w:t xml:space="preserve"> </w:t>
+      </w:r>
+      <w:r>
+        <w:t xml:space="preserve">as a PfBDP1-directed antimalarial lead.</w:t>
+      </w:r>
+    </w:p>
+    <w:bookmarkEnd w:id="45"/>
+    <w:bookmarkStart w:id="109" w:name="supplementary-data"/>
+    <w:p>
+      <w:pPr>
+        <w:pStyle w:val="Heading1"/>
+      </w:pPr>
+      <w:r>
+        <w:t xml:space="preserve">5. Supplementary Data</w:t>
+      </w:r>
+    </w:p>
+    <w:tbl>
+      <w:tblPr>
+        <w:tblStyle w:val="Table"/>
+        <w:tblW w:type="pct" w:w="5000"/>
+        <w:tblLayout w:type="fixed"/>
+        <w:tblLook w:firstRow="0" w:lastRow="0" w:firstColumn="0" w:lastColumn="0" w:noHBand="0" w:noVBand="0" w:val="0000"/>
+      </w:tblPr>
+      <w:tblGrid>
+        <w:gridCol w:w="7920"/>
+      </w:tblGrid>
+      <w:tr>
+        <w:tc>
+          <w:tcPr/>
+          <w:bookmarkStart w:id="46" w:name="dat-screening-results"/>
+          <w:p>
+            <w:pPr>
+              <w:jc w:val="center"/>
+            </w:pPr>
+            <w:pPr>
+              <w:jc w:val="left"/>
+              <w:spacing w:before="200"/>
+              <w:pStyle w:val="ImageCaption"/>
+            </w:pPr>
+            <w:r>
+              <w:t xml:space="preserve">Supplementary Data S1: Docking and hit-selection records for the five Enamine candidates, including</w:t>
+            </w:r>
+            <w:r>
+              <w:t xml:space="preserve"> </w:t>
+            </w:r>
+            <w:r>
+              <w:t xml:space="preserve">compound identifiers, scores, physicochemical descriptors, structures, and</w:t>
+            </w:r>
+            <w:r>
+              <w:t xml:space="preserve"> </w:t>
+            </w:r>
+            <w:r>
+              <w:t xml:space="preserve">binding estimates.</w:t>
+            </w:r>
+          </w:p>
+          <w:bookmarkEnd w:id="46"/>
+        </w:tc>
+      </w:tr>
+    </w:tbl>
+    <w:p>
+      <w:pPr>
+        <w:pStyle w:val="BodyText"/>
+      </w:pPr>
+      <w:r>
+        <w:t xml:space="preserve"> </w:t>
+      </w:r>
+    </w:p>
+    <w:tbl>
+      <w:tblPr>
+        <w:tblStyle w:val="Table"/>
+        <w:tblW w:type="pct" w:w="5000"/>
+        <w:tblLayout w:type="fixed"/>
+        <w:tblLook w:firstRow="0" w:lastRow="0" w:firstColumn="0" w:lastColumn="0" w:noHBand="0" w:noVBand="0" w:val="0000"/>
+      </w:tblPr>
+      <w:tblGrid>
+        <w:gridCol w:w="7920"/>
+      </w:tblGrid>
+      <w:tr>
+        <w:tc>
+          <w:tcPr/>
+          <w:bookmarkStart w:id="47" w:name="dat-admet-profiles"/>
+          <w:p>
+            <w:pPr>
+              <w:jc w:val="center"/>
+            </w:pPr>
+            <w:pPr>
+              <w:jc w:val="left"/>
+              <w:spacing w:before="200"/>
+              <w:pStyle w:val="ImageCaption"/>
+            </w:pPr>
+            <w:r>
+              <w:t xml:space="preserve">Supplementary Data S2: Compound-level physicochemical descriptors and ADMET-AI predictions for the</w:t>
+            </w:r>
+            <w:r>
+              <w:t xml:space="preserve"> </w:t>
+            </w:r>
+            <w:r>
+              <w:t xml:space="preserve">five Enamine candidates and the co-crystallized reference ligand I5K.</w:t>
+            </w:r>
+          </w:p>
+          <w:bookmarkEnd w:id="47"/>
+        </w:tc>
+      </w:tr>
+    </w:tbl>
+    <w:bookmarkStart w:id="108" w:name="refs"/>
+    <w:bookmarkStart w:id="49" w:name="ref-abrahamGROMACSHighPerformance2015"/>
     <w:p>
       <w:pPr>
         <w:pStyle w:val="Bibliography"/>
@@ -3818,7 +4487,7 @@
       <w:r>
         <w:t xml:space="preserve"> </w:t>
       </w:r>
-      <w:hyperlink r:id="rId42">
+      <w:hyperlink r:id="rId48">
         <w:r>
           <w:rPr>
             <w:rStyle w:val="Hyperlink"/>
@@ -3830,8 +4499,8 @@
         <w:t xml:space="preserve">.</w:t>
       </w:r>
     </w:p>
-    <w:bookmarkEnd w:id="43"/>
-    <w:bookmarkStart w:id="45" w:name="Xe6616dd3440a01982bea3a01ea7030aa530a08c"/>
+    <w:bookmarkEnd w:id="49"/>
+    <w:bookmarkStart w:id="51" w:name="Xe6616dd3440a01982bea3a01ea7030aa530a08c"/>
     <w:p>
       <w:pPr>
         <w:pStyle w:val="Bibliography"/>
@@ -3888,7 +4557,7 @@
       <w:r>
         <w:t xml:space="preserve"> </w:t>
       </w:r>
-      <w:hyperlink r:id="rId44">
+      <w:hyperlink r:id="rId50">
         <w:r>
           <w:rPr>
             <w:rStyle w:val="Hyperlink"/>
@@ -3900,8 +4569,8 @@
         <w:t xml:space="preserve">.</w:t>
       </w:r>
     </w:p>
-    <w:bookmarkEnd w:id="45"/>
-    <w:bookmarkStart w:id="47" w:name="ref-amannNovelInhibitorBromodomain2025"/>
+    <w:bookmarkEnd w:id="51"/>
+    <w:bookmarkStart w:id="53" w:name="ref-amannNovelInhibitorBromodomain2025"/>
     <w:p>
       <w:pPr>
         <w:pStyle w:val="Bibliography"/>
@@ -3977,7 +4646,7 @@
       <w:r>
         <w:t xml:space="preserve"> </w:t>
       </w:r>
-      <w:hyperlink r:id="rId46">
+      <w:hyperlink r:id="rId52">
         <w:r>
           <w:rPr>
             <w:rStyle w:val="Hyperlink"/>
@@ -3989,8 +4658,8 @@
         <w:t xml:space="preserve">.</w:t>
       </w:r>
     </w:p>
-    <w:bookmarkEnd w:id="47"/>
-    <w:bookmarkStart w:id="49" w:name="ref-amann2024"/>
+    <w:bookmarkEnd w:id="53"/>
+    <w:bookmarkStart w:id="55" w:name="ref-amann2024"/>
     <w:p>
       <w:pPr>
         <w:pStyle w:val="Bibliography"/>
@@ -4014,7 +4683,7 @@
       <w:r>
         <w:t xml:space="preserve"> </w:t>
       </w:r>
-      <w:hyperlink r:id="rId48">
+      <w:hyperlink r:id="rId54">
         <w:r>
           <w:rPr>
             <w:rStyle w:val="Hyperlink"/>
@@ -4026,8 +4695,8 @@
         <w:t xml:space="preserve">.</w:t>
       </w:r>
     </w:p>
-    <w:bookmarkEnd w:id="49"/>
-    <w:bookmarkStart w:id="51" w:name="ref-Armstrong2023MalariaPharm"/>
+    <w:bookmarkEnd w:id="55"/>
+    <w:bookmarkStart w:id="57" w:name="ref-Armstrong2023MalariaPharm"/>
     <w:p>
       <w:pPr>
         <w:pStyle w:val="Bibliography"/>
@@ -4081,7 +4750,7 @@
       <w:r>
         <w:t xml:space="preserve"> </w:t>
       </w:r>
-      <w:hyperlink r:id="rId50">
+      <w:hyperlink r:id="rId56">
         <w:r>
           <w:rPr>
             <w:rStyle w:val="Hyperlink"/>
@@ -4093,8 +4762,8 @@
         <w:t xml:space="preserve">.</w:t>
       </w:r>
     </w:p>
-    <w:bookmarkEnd w:id="51"/>
-    <w:bookmarkStart w:id="52" w:name="ref-Blasco2017"/>
+    <w:bookmarkEnd w:id="57"/>
+    <w:bookmarkStart w:id="58" w:name="ref-Blasco2017"/>
     <w:p>
       <w:pPr>
         <w:pStyle w:val="Bibliography"/>
@@ -4125,8 +4794,8 @@
         <w:t xml:space="preserve">23 (8): 917–28.</w:t>
       </w:r>
     </w:p>
-    <w:bookmarkEnd w:id="52"/>
-    <w:bookmarkStart w:id="54" w:name="ref-jnNewDevelopmentsAntimalarial2017"/>
+    <w:bookmarkEnd w:id="58"/>
+    <w:bookmarkStart w:id="60" w:name="ref-jnNewDevelopmentsAntimalarial2017"/>
     <w:p>
       <w:pPr>
         <w:pStyle w:val="Bibliography"/>
@@ -4159,7 +4828,7 @@
       <w:r>
         <w:t xml:space="preserve"> </w:t>
       </w:r>
-      <w:hyperlink r:id="rId53">
+      <w:hyperlink r:id="rId59">
         <w:r>
           <w:rPr>
             <w:rStyle w:val="Hyperlink"/>
@@ -4171,8 +4840,8 @@
         <w:t xml:space="preserve">.</w:t>
       </w:r>
     </w:p>
-    <w:bookmarkEnd w:id="54"/>
-    <w:bookmarkStart w:id="56" w:name="ref-Burrows2013TCP"/>
+    <w:bookmarkEnd w:id="60"/>
+    <w:bookmarkStart w:id="62" w:name="ref-Burrows2013TCP"/>
     <w:p>
       <w:pPr>
         <w:pStyle w:val="Bibliography"/>
@@ -4205,7 +4874,7 @@
       <w:r>
         <w:t xml:space="preserve"> </w:t>
       </w:r>
-      <w:hyperlink r:id="rId55">
+      <w:hyperlink r:id="rId61">
         <w:r>
           <w:rPr>
             <w:rStyle w:val="Hyperlink"/>
@@ -4217,8 +4886,8 @@
         <w:t xml:space="preserve">.</w:t>
       </w:r>
     </w:p>
-    <w:bookmarkEnd w:id="56"/>
-    <w:bookmarkStart w:id="58" w:name="ref-bussiCanonicalSamplingVelocity2007"/>
+    <w:bookmarkEnd w:id="62"/>
+    <w:bookmarkStart w:id="64" w:name="ref-bussiCanonicalSamplingVelocity2007"/>
     <w:p>
       <w:pPr>
         <w:pStyle w:val="Bibliography"/>
@@ -4251,7 +4920,7 @@
       <w:r>
         <w:t xml:space="preserve"> </w:t>
       </w:r>
-      <w:hyperlink r:id="rId57">
+      <w:hyperlink r:id="rId63">
         <w:r>
           <w:rPr>
             <w:rStyle w:val="Hyperlink"/>
@@ -4263,8 +4932,8 @@
         <w:t xml:space="preserve">.</w:t>
       </w:r>
     </w:p>
-    <w:bookmarkEnd w:id="58"/>
-    <w:bookmarkStart w:id="59" w:name="ref-buttenschoen2024posebusters"/>
+    <w:bookmarkEnd w:id="64"/>
+    <w:bookmarkStart w:id="65" w:name="ref-buttenschoen2024posebusters"/>
     <w:p>
       <w:pPr>
         <w:pStyle w:val="Bibliography"/>
@@ -4295,8 +4964,8 @@
         <w:t xml:space="preserve">15 (9): 3130–39.</w:t>
       </w:r>
     </w:p>
-    <w:bookmarkEnd w:id="59"/>
-    <w:bookmarkStart w:id="61" w:name="ref-compound"/>
+    <w:bookmarkEnd w:id="65"/>
+    <w:bookmarkStart w:id="67" w:name="ref-compound"/>
     <w:p>
       <w:pPr>
         <w:pStyle w:val="Bibliography"/>
@@ -4314,7 +4983,7 @@
       <w:r>
         <w:t xml:space="preserve"> </w:t>
       </w:r>
-      <w:hyperlink r:id="rId60">
+      <w:hyperlink r:id="rId66">
         <w:r>
           <w:rPr>
             <w:rStyle w:val="Hyperlink"/>
@@ -4326,8 +4995,8 @@
         <w:t xml:space="preserve">.</w:t>
       </w:r>
     </w:p>
-    <w:bookmarkEnd w:id="61"/>
-    <w:bookmarkStart w:id="63" w:name="ref-dardenParticleMeshEwald1993"/>
+    <w:bookmarkEnd w:id="67"/>
+    <w:bookmarkStart w:id="69" w:name="ref-dardenParticleMeshEwald1993"/>
     <w:p>
       <w:pPr>
         <w:pStyle w:val="Bibliography"/>
@@ -4404,7 +5073,7 @@
       <w:r>
         <w:t xml:space="preserve"> </w:t>
       </w:r>
-      <w:hyperlink r:id="rId62">
+      <w:hyperlink r:id="rId68">
         <w:r>
           <w:rPr>
             <w:rStyle w:val="Hyperlink"/>
@@ -4416,8 +5085,8 @@
         <w:t xml:space="preserve">.</w:t>
       </w:r>
     </w:p>
-    <w:bookmarkEnd w:id="63"/>
-    <w:bookmarkStart w:id="65" w:name="ref-eastman2017"/>
+    <w:bookmarkEnd w:id="69"/>
+    <w:bookmarkStart w:id="71" w:name="ref-eastman2017"/>
     <w:p>
       <w:pPr>
         <w:pStyle w:val="Bibliography"/>
@@ -4450,7 +5119,7 @@
       <w:r>
         <w:t xml:space="preserve"> </w:t>
       </w:r>
-      <w:hyperlink r:id="rId64">
+      <w:hyperlink r:id="rId70">
         <w:r>
           <w:rPr>
             <w:rStyle w:val="Hyperlink"/>
@@ -4462,8 +5131,8 @@
         <w:t xml:space="preserve">.</w:t>
       </w:r>
     </w:p>
-    <w:bookmarkEnd w:id="65"/>
-    <w:bookmarkStart w:id="67" w:name="ref-Godara2024MultiKinaseVS"/>
+    <w:bookmarkEnd w:id="71"/>
+    <w:bookmarkStart w:id="73" w:name="ref-Godara2024MultiKinaseVS"/>
     <w:p>
       <w:pPr>
         <w:pStyle w:val="Bibliography"/>
@@ -4508,7 +5177,7 @@
       <w:r>
         <w:t xml:space="preserve"> </w:t>
       </w:r>
-      <w:hyperlink r:id="rId66">
+      <w:hyperlink r:id="rId72">
         <w:r>
           <w:rPr>
             <w:rStyle w:val="Hyperlink"/>
@@ -4520,8 +5189,8 @@
         <w:t xml:space="preserve">.</w:t>
       </w:r>
     </w:p>
-    <w:bookmarkEnd w:id="67"/>
-    <w:bookmarkStart w:id="69" w:name="ref-grygorenko2021"/>
+    <w:bookmarkEnd w:id="73"/>
+    <w:bookmarkStart w:id="75" w:name="ref-grygorenko2021"/>
     <w:p>
       <w:pPr>
         <w:pStyle w:val="Bibliography"/>
@@ -4554,7 +5223,7 @@
       <w:r>
         <w:t xml:space="preserve"> </w:t>
       </w:r>
-      <w:hyperlink r:id="rId68">
+      <w:hyperlink r:id="rId74">
         <w:r>
           <w:rPr>
             <w:rStyle w:val="Hyperlink"/>
@@ -4566,8 +5235,8 @@
         <w:t xml:space="preserve">.</w:t>
       </w:r>
     </w:p>
-    <w:bookmarkEnd w:id="69"/>
-    <w:bookmarkStart w:id="71" w:name="ref-hessLINCSLinearConstraint1997"/>
+    <w:bookmarkEnd w:id="75"/>
+    <w:bookmarkStart w:id="77" w:name="ref-hessLINCSLinearConstraint1997"/>
     <w:p>
       <w:pPr>
         <w:pStyle w:val="Bibliography"/>
@@ -4618,7 +5287,7 @@
       <w:r>
         <w:t xml:space="preserve"> </w:t>
       </w:r>
-      <w:hyperlink r:id="rId70">
+      <w:hyperlink r:id="rId76">
         <w:r>
           <w:rPr>
             <w:rStyle w:val="Hyperlink"/>
@@ -4630,8 +5299,8 @@
         <w:t xml:space="preserve">.</w:t>
       </w:r>
     </w:p>
-    <w:bookmarkEnd w:id="71"/>
-    <w:bookmarkStart w:id="73" w:name="ref-huangCHARMM36AllatomAdditive2013"/>
+    <w:bookmarkEnd w:id="77"/>
+    <w:bookmarkStart w:id="79" w:name="ref-huangCHARMM36AllatomAdditive2013"/>
     <w:p>
       <w:pPr>
         <w:pStyle w:val="Bibliography"/>
@@ -4697,7 +5366,7 @@
       <w:r>
         <w:t xml:space="preserve"> </w:t>
       </w:r>
-      <w:hyperlink r:id="rId72">
+      <w:hyperlink r:id="rId78">
         <w:r>
           <w:rPr>
             <w:rStyle w:val="Hyperlink"/>
@@ -4709,8 +5378,8 @@
         <w:t xml:space="preserve">.</w:t>
       </w:r>
     </w:p>
-    <w:bookmarkEnd w:id="73"/>
-    <w:bookmarkStart w:id="75" w:name="ref-josling2015"/>
+    <w:bookmarkEnd w:id="79"/>
+    <w:bookmarkStart w:id="81" w:name="ref-josling2015"/>
     <w:p>
       <w:pPr>
         <w:pStyle w:val="Bibliography"/>
@@ -4743,7 +5412,7 @@
       <w:r>
         <w:t xml:space="preserve"> </w:t>
       </w:r>
-      <w:hyperlink r:id="rId74">
+      <w:hyperlink r:id="rId80">
         <w:r>
           <w:rPr>
             <w:rStyle w:val="Hyperlink"/>
@@ -4755,8 +5424,8 @@
         <w:t xml:space="preserve">.</w:t>
       </w:r>
     </w:p>
-    <w:bookmarkEnd w:id="75"/>
-    <w:bookmarkStart w:id="77" w:name="ref-laboratory2026"/>
+    <w:bookmarkEnd w:id="81"/>
+    <w:bookmarkStart w:id="83" w:name="ref-laboratory2026"/>
     <w:p>
       <w:pPr>
         <w:pStyle w:val="Bibliography"/>
@@ -4780,7 +5449,7 @@
       <w:r>
         <w:t xml:space="preserve"> </w:t>
       </w:r>
-      <w:hyperlink r:id="rId76">
+      <w:hyperlink r:id="rId82">
         <w:r>
           <w:rPr>
             <w:rStyle w:val="Hyperlink"/>
@@ -4792,8 +5461,8 @@
         <w:t xml:space="preserve">.</w:t>
       </w:r>
     </w:p>
-    <w:bookmarkEnd w:id="77"/>
-    <w:bookmarkStart w:id="79" w:name="ref-greglandrum2026"/>
+    <w:bookmarkEnd w:id="83"/>
+    <w:bookmarkStart w:id="85" w:name="ref-greglandrum2026"/>
     <w:p>
       <w:pPr>
         <w:pStyle w:val="Bibliography"/>
@@ -4855,7 +5524,7 @@
       <w:r>
         <w:t xml:space="preserve"> </w:t>
       </w:r>
-      <w:hyperlink r:id="rId78">
+      <w:hyperlink r:id="rId84">
         <w:r>
           <w:rPr>
             <w:rStyle w:val="Hyperlink"/>
@@ -4867,8 +5536,8 @@
         <w:t xml:space="preserve">.</w:t>
       </w:r>
     </w:p>
-    <w:bookmarkEnd w:id="79"/>
-    <w:bookmarkStart w:id="80" w:name="ref-lipinski1997experimental"/>
+    <w:bookmarkEnd w:id="85"/>
+    <w:bookmarkStart w:id="86" w:name="ref-lipinski1997experimental"/>
     <w:p>
       <w:pPr>
         <w:pStyle w:val="Bibliography"/>
@@ -4899,8 +5568,83 @@
         <w:t xml:space="preserve">23 (1-3): 3–25.</w:t>
       </w:r>
     </w:p>
-    <w:bookmarkEnd w:id="80"/>
-    <w:bookmarkStart w:id="82" w:name="ref-OBoyle2011"/>
+    <w:bookmarkEnd w:id="86"/>
+    <w:bookmarkStart w:id="88" w:name="X781048b305df366de2a6aae7461ec5b0e46b13f"/>
+    <w:p>
+      <w:pPr>
+        <w:pStyle w:val="Bibliography"/>
+      </w:pPr>
+      <w:r>
+        <w:t xml:space="preserve">Nguyen, Thi Tuyet Nhung, Yu-Chi Lin, Le-Anh-Tuan Nguyen, et al. 2025.</w:t>
+      </w:r>
+      <w:r>
+        <w:t xml:space="preserve"> </w:t>
+      </w:r>
+      <w:r>
+        <w:t xml:space="preserve">“Application of Bioactive Molecular Networking to Identify Corneal-Cytoprotective Compounds from</w:t>
+      </w:r>
+      <w:r>
+        <w:t xml:space="preserve"> </w:t>
+      </w:r>
+      <w:r>
+        <w:rPr>
+          <w:i/>
+          <w:iCs/>
+        </w:rPr>
+        <w:t xml:space="preserve">Dialium</w:t>
+      </w:r>
+      <w:r>
+        <w:t xml:space="preserve"> </w:t>
+      </w:r>
+      <w:r>
+        <w:rPr>
+          <w:i/>
+          <w:iCs/>
+        </w:rPr>
+        <w:t xml:space="preserve">Cochinchinense</w:t>
+      </w:r>
+      <w:r>
+        <w:t xml:space="preserve"> </w:t>
+      </w:r>
+      <w:r>
+        <w:t xml:space="preserve">Pierre</w:t>
+      </w:r>
+      <w:r>
+        <w:t xml:space="preserve">. Leaves.”</w:t>
+      </w:r>
+      <w:r>
+        <w:t xml:space="preserve"> </w:t>
+      </w:r>
+      <w:r>
+        <w:rPr>
+          <w:i/>
+          <w:iCs/>
+        </w:rPr>
+        <w:t xml:space="preserve">Current Plant Biology</w:t>
+      </w:r>
+      <w:r>
+        <w:t xml:space="preserve"> </w:t>
+      </w:r>
+      <w:r>
+        <w:t xml:space="preserve">42 (June): 100489.</w:t>
+      </w:r>
+      <w:r>
+        <w:t xml:space="preserve"> </w:t>
+      </w:r>
+      <w:hyperlink r:id="rId87">
+        <w:r>
+          <w:rPr>
+            <w:rStyle w:val="Hyperlink"/>
+          </w:rPr>
+          <w:t xml:space="preserve">https://doi.org/10.1016/j.cpb.2025.100489</w:t>
+        </w:r>
+      </w:hyperlink>
+      <w:r>
+        <w:t xml:space="preserve">.</w:t>
+      </w:r>
+    </w:p>
+    <w:bookmarkEnd w:id="88"/>
+    <w:bookmarkStart w:id="90" w:name="ref-OBoyle2011"/>
     <w:p>
       <w:pPr>
         <w:pStyle w:val="Bibliography"/>
@@ -4933,7 +5677,7 @@
       <w:r>
         <w:t xml:space="preserve"> </w:t>
       </w:r>
-      <w:hyperlink r:id="rId81">
+      <w:hyperlink r:id="rId89">
         <w:r>
           <w:rPr>
             <w:rStyle w:val="Hyperlink"/>
@@ -4945,8 +5689,8 @@
         <w:t xml:space="preserve">.</w:t>
       </w:r>
     </w:p>
-    <w:bookmarkEnd w:id="82"/>
-    <w:bookmarkStart w:id="84" w:name="ref-osg2006"/>
+    <w:bookmarkEnd w:id="90"/>
+    <w:bookmarkStart w:id="92" w:name="ref-osg2006"/>
     <w:p>
       <w:pPr>
         <w:pStyle w:val="Bibliography"/>
@@ -4970,7 +5714,7 @@
       <w:r>
         <w:t xml:space="preserve"> </w:t>
       </w:r>
-      <w:hyperlink r:id="rId83">
+      <w:hyperlink r:id="rId91">
         <w:r>
           <w:rPr>
             <w:rStyle w:val="Hyperlink"/>
@@ -4982,8 +5726,8 @@
         <w:t xml:space="preserve">.</w:t>
       </w:r>
     </w:p>
-    <w:bookmarkEnd w:id="84"/>
-    <w:bookmarkStart w:id="86" w:name="X7e7666b4982a28a7379c697b2057d381c2e1bb2"/>
+    <w:bookmarkEnd w:id="92"/>
+    <w:bookmarkStart w:id="94" w:name="X7e7666b4982a28a7379c697b2057d381c2e1bb2"/>
     <w:p>
       <w:pPr>
         <w:pStyle w:val="Bibliography"/>
@@ -5028,7 +5772,7 @@
       <w:r>
         <w:t xml:space="preserve"> </w:t>
       </w:r>
-      <w:hyperlink r:id="rId85">
+      <w:hyperlink r:id="rId93">
         <w:r>
           <w:rPr>
             <w:rStyle w:val="Hyperlink"/>
@@ -5040,8 +5784,8 @@
         <w:t xml:space="preserve">.</w:t>
       </w:r>
     </w:p>
-    <w:bookmarkEnd w:id="86"/>
-    <w:bookmarkStart w:id="88" w:name="ref-santos-martins2025"/>
+    <w:bookmarkEnd w:id="94"/>
+    <w:bookmarkStart w:id="96" w:name="ref-santos-martins2025"/>
     <w:p>
       <w:pPr>
         <w:pStyle w:val="Bibliography"/>
@@ -5074,7 +5818,7 @@
       <w:r>
         <w:t xml:space="preserve"> </w:t>
       </w:r>
-      <w:hyperlink r:id="rId87">
+      <w:hyperlink r:id="rId95">
         <w:r>
           <w:rPr>
             <w:rStyle w:val="Hyperlink"/>
@@ -5086,8 +5830,8 @@
         <w:t xml:space="preserve">.</w:t>
       </w:r>
     </w:p>
-    <w:bookmarkEnd w:id="88"/>
-    <w:bookmarkStart w:id="90" w:name="ref-swansonADMETAIMachineLearning2024"/>
+    <w:bookmarkEnd w:id="96"/>
+    <w:bookmarkStart w:id="98" w:name="ref-swansonADMETAIMachineLearning2024"/>
     <w:p>
       <w:pPr>
         <w:pStyle w:val="Bibliography"/>
@@ -5138,7 +5882,7 @@
       <w:r>
         <w:t xml:space="preserve"> </w:t>
       </w:r>
-      <w:hyperlink r:id="rId89">
+      <w:hyperlink r:id="rId97">
         <w:r>
           <w:rPr>
             <w:rStyle w:val="Hyperlink"/>
@@ -5150,8 +5894,8 @@
         <w:t xml:space="preserve">.</w:t>
       </w:r>
     </w:p>
-    <w:bookmarkEnd w:id="90"/>
-    <w:bookmarkStart w:id="91" w:name="ref-SwissParamFastForce"/>
+    <w:bookmarkEnd w:id="98"/>
+    <w:bookmarkStart w:id="99" w:name="ref-SwissParamFastForce"/>
     <w:p>
       <w:pPr>
         <w:pStyle w:val="Bibliography"/>
@@ -5300,8 +6044,8 @@
         <w:t xml:space="preserve">. n.d. Https://onlinelibrary.wiley.com/doi/abs/10.1002/jcc.21816.</w:t>
       </w:r>
     </w:p>
-    <w:bookmarkEnd w:id="91"/>
-    <w:bookmarkStart w:id="93" w:name="ref-Trott2010"/>
+    <w:bookmarkEnd w:id="99"/>
+    <w:bookmarkStart w:id="101" w:name="ref-Trott2010"/>
     <w:p>
       <w:pPr>
         <w:pStyle w:val="Bibliography"/>
@@ -5334,7 +6078,7 @@
       <w:r>
         <w:t xml:space="preserve"> </w:t>
       </w:r>
-      <w:hyperlink r:id="rId92">
+      <w:hyperlink r:id="rId100">
         <w:r>
           <w:rPr>
             <w:rStyle w:val="Hyperlink"/>
@@ -5346,8 +6090,8 @@
         <w:t xml:space="preserve">.</w:t>
       </w:r>
     </w:p>
-    <w:bookmarkEnd w:id="93"/>
-    <w:bookmarkStart w:id="95" w:name="ref-valdes-tresancoGmx_MMPBSANewTool2021"/>
+    <w:bookmarkEnd w:id="101"/>
+    <w:bookmarkStart w:id="103" w:name="ref-valdes-tresancoGmx_MMPBSANewTool2021"/>
     <w:p>
       <w:pPr>
         <w:pStyle w:val="Bibliography"/>
@@ -5419,7 +6163,7 @@
       <w:r>
         <w:t xml:space="preserve"> </w:t>
       </w:r>
-      <w:hyperlink r:id="rId94">
+      <w:hyperlink r:id="rId102">
         <w:r>
           <w:rPr>
             <w:rStyle w:val="Hyperlink"/>
@@ -5431,8 +6175,8 @@
         <w:t xml:space="preserve">.</w:t>
       </w:r>
     </w:p>
-    <w:bookmarkEnd w:id="95"/>
-    <w:bookmarkStart w:id="97" w:name="ref-word1999"/>
+    <w:bookmarkEnd w:id="103"/>
+    <w:bookmarkStart w:id="105" w:name="ref-word1999"/>
     <w:p>
       <w:pPr>
         <w:pStyle w:val="Bibliography"/>
@@ -5465,7 +6209,7 @@
       <w:r>
         <w:t xml:space="preserve"> </w:t>
       </w:r>
-      <w:hyperlink r:id="rId96">
+      <w:hyperlink r:id="rId104">
         <w:r>
           <w:rPr>
             <w:rStyle w:val="Hyperlink"/>
@@ -5477,8 +6221,8 @@
         <w:t xml:space="preserve">.</w:t>
       </w:r>
     </w:p>
-    <w:bookmarkEnd w:id="97"/>
-    <w:bookmarkStart w:id="99" w:name="ref-WHO2025Malaria"/>
+    <w:bookmarkEnd w:id="105"/>
+    <w:bookmarkStart w:id="107" w:name="ref-WHO2025Malaria"/>
     <w:p>
       <w:pPr>
         <w:pStyle w:val="Bibliography"/>
@@ -5502,7 +6246,7 @@
       <w:r>
         <w:t xml:space="preserve"> </w:t>
       </w:r>
-      <w:hyperlink r:id="rId98">
+      <w:hyperlink r:id="rId106">
         <w:r>
           <w:rPr>
             <w:rStyle w:val="Hyperlink"/>
@@ -5514,10 +6258,9 @@
         <w:t xml:space="preserve">.</w:t>
       </w:r>
     </w:p>
-    <w:bookmarkEnd w:id="99"/>
-    <w:bookmarkEnd w:id="100"/>
-    <w:bookmarkEnd w:id="101"/>
-    <w:bookmarkEnd w:id="102"/>
+    <w:bookmarkEnd w:id="107"/>
+    <w:bookmarkEnd w:id="108"/>
+    <w:bookmarkEnd w:id="109"/>
     <w:sectPr>
       <w:footnotePr>
         <w:numRestart w:val="eachSect"/>

</xml_diff>